<commit_message>
Freud: reorganiza los apuntes (tres humillaciones y doctrina ampliada con las dos tópicas)
Co-Authored-By: Claude Opus 5.5 <noreply@anthropic.com>
Claude-Session: https://claude.ai/code/session_01Fj7SZp3YYQfX9U1XL9NLBt
</commit_message>
<xml_diff>
--- a/formacion-general/hombre-y-mundo-moderno/apuntes-word/Freud.docx
+++ b/formacion-general/hombre-y-mundo-moderno/apuntes-word/Freud.docx
@@ -28,34 +28,79 @@
         <w:pStyle w:val="Heading1"/>
       </w:pPr>
       <w:r>
-        <w:t xml:space="preserve">1. Contexto</w:t>
-      </w:r>
-    </w:p>
-    <w:p>
-      <w:pPr>
-        <w:spacing w:after="160" w:line="360"/>
-        <w:jc w:val="both"/>
-      </w:pPr>
-      <w:r>
-        <w:t xml:space="preserve">Paul Ricoeur dice que el siglo XX está marcado por tres autores que nos han hecho dudar de nuestra conciencia, los maestros de la sospecha: Karl Marx, Friedrich Nietzsche y Sigmund Freud.</w:t>
-      </w:r>
-    </w:p>
-    <w:p>
-      <w:pPr>
-        <w:spacing w:after="160" w:line="360"/>
-        <w:jc w:val="both"/>
-      </w:pPr>
-      <w:r>
-        <w:t xml:space="preserve">Para entender a Freud hay que ir a la Alemania del siglo XIX. Hasta Napoleón, Alemania era el Sacro Imperio Romano Germánico. Napoleón reorganiza los Estados en la Confederación del Rin y en 1806 Francisco II renuncia y se acaba el Sacro Imperio. Tras el Congreso de Viena (1815) se crea la Confederación Germánica con dos polos: Prusia y Austria. Prusia gana fuerza con el Zollverein (1834) y con Bismarck derrota a Austria en 1866. Austria se queda fuera de los asuntos alemanes, se convierte en Austria-Hungría (1867), un imperio con muchas etnias y religiones gobernado desde Viena, y se expande hacia los Balcanes, lo que acabará provocando la I Guerra Mundial.</w:t>
-      </w:r>
-    </w:p>
-    <w:p>
-      <w:pPr>
-        <w:spacing w:after="160" w:line="360"/>
-        <w:jc w:val="both"/>
-      </w:pPr>
-      <w:r>
-        <w:t xml:space="preserve">Freud nace en 1856 en Moravia (hoy República Checa, entonces Imperio austriaco) en una familia judía que se muda a Viena. Allí estudia Medicina y es ayudante del profesor Brücke (quería estudiar las neuronas). Su mentor es Joseph Breuer, con quien estudia la histeria de las mujeres a través de la hipnosis. Con una beca estudia en París con Charcot. A partir de ahí salta a la fama con el psicoanálisis. La I Guerra Mundial le hace cambiar su teoría (pulsión de muerte) y con el ascenso del nazismo tiene que huir a Londres, donde muere en 1939.</w:t>
+        <w:t xml:space="preserve">1. Sitúe a Freud en su época: acontecimientos históricos, obras, corrientes de pensamiento y autores que le preceden</w:t>
+      </w:r>
+    </w:p>
+    <w:p>
+      <w:pPr>
+        <w:spacing w:after="160" w:line="360"/>
+        <w:jc w:val="both"/>
+      </w:pPr>
+      <w:r>
+        <w:t xml:space="preserve">Paul Ricoeur, en Freud: una interpretación de la cultura (1965), dice que el siglo XX está marcado por tres autores que nos han hecho dudar de nuestra propia conciencia. Son los llamados maestros de la sospecha: Karl Marx, Friedrich Nietzsche y Sigmund Freud.</w:t>
+      </w:r>
+    </w:p>
+    <w:p>
+      <w:pPr>
+        <w:spacing w:after="160" w:line="360"/>
+        <w:jc w:val="both"/>
+      </w:pPr>
+      <w:r>
+        <w:t xml:space="preserve">Freud nació en 1856 en una familia judía de origen checo, aunque en ese momento ese territorio pertenecía al Imperio austriaco, que tras la caída del Sacro Imperio Romano Germánico y su derrota frente a Prusia se había convertido en Austria-Hungría. Su familia se mudó a Viena, donde estudió en la universidad. Fue ayudante del profesor Brücke, con quien quería estudiar las neuronas, y su mentor fue Joseph Breuer, con quien estudió la histeria de las mujeres a través de la hipnosis. Con una beca estudió en París con Jean-Martin Charcot. A partir de ahí saltó a la fama con el psicoanálisis. Con el ascenso del nazismo tuvo que huir a Londres, donde murió en 1939.</w:t>
+      </w:r>
+    </w:p>
+    <w:p>
+      <w:pPr>
+        <w:spacing w:after="160" w:line="360"/>
+        <w:jc w:val="both"/>
+      </w:pPr>
+      <w:r>
+        <w:t xml:space="preserve">Sus obras principales son Estudios sobre la histeria (1895), La interpretación de los sueños (1900), Psicopatología de la vida cotidiana (1901), Tres ensayos de teoría sexual (1905), Tótem y tabú (1913), Lo inconsciente (1915), Más allá del principio del placer (1920), El yo y el ello (1923) y El malestar en la cultura (1930).</w:t>
+      </w:r>
+    </w:p>
+    <w:p>
+      <w:pPr>
+        <w:spacing w:after="160" w:line="360"/>
+        <w:jc w:val="both"/>
+      </w:pPr>
+      <w:r>
+        <w:t xml:space="preserve">Para presentar a Freud hay que hablar de las tres humillaciones que, de la mano de los científicos, ha sufrido el ser humano. Freud lo explica en Una dificultad del psicoanálisis (1917). Durante siglos el hombre se había visto a sí mismo como el centro de todo, como un ser especial y como dueño de sí mismo. La ciencia moderna le ha ido quitando, una a una, estas tres seguridades.</w:t>
+      </w:r>
+    </w:p>
+    <w:p>
+      <w:pPr>
+        <w:spacing w:after="160" w:line="360"/>
+        <w:jc w:val="both"/>
+      </w:pPr>
+      <w:r>
+        <w:t xml:space="preserve">La primera humillación es la de Copérnico. Hasta el siglo XVI se pensaba que la Tierra estaba quieta en el centro del universo y que el sol y los planetas giraban a su alrededor. Copérnico demostró que es la Tierra la que gira alrededor del sol. El ser humano descubre así que no es el centro del universo, sino que vive en un planeta más entre otros. Es una humillación cosmológica.</w:t>
+      </w:r>
+    </w:p>
+    <w:p>
+      <w:pPr>
+        <w:spacing w:after="160" w:line="360"/>
+        <w:jc w:val="both"/>
+      </w:pPr>
+      <w:r>
+        <w:t xml:space="preserve">La segunda humillación es la de Darwin. Con El origen de las especies (1859) y El origen del hombre (1871), Darwin explica que todas las especies tienen un origen común y que han ido cambiando por la lucha por la supervivencia: sobreviven los individuos más adaptados, por selección natural, y transmiten sus caracteres a sus descendientes. El ser humano es el resultado de esa misma evolución, así que no es especial, sino un animal más, movido por los mismos instintos que el resto. Es una humillación biológica.</w:t>
+      </w:r>
+    </w:p>
+    <w:p>
+      <w:pPr>
+        <w:spacing w:after="160" w:line="360"/>
+        <w:jc w:val="both"/>
+      </w:pPr>
+      <w:r>
+        <w:t xml:space="preserve">La tercera humillación es la del propio Freud. Al ser humano le quedaba al menos la seguridad de ser dueño de su mente, de saber lo que piensa y por qué actúa. Freud, con el psicoanálisis, le quita también eso: gran parte de lo que pensamos y hacemos depende del inconsciente, que no controlamos. El ser humano ni siquiera es dueño de su propia mente. Es una humillación psicológica.</w:t>
+      </w:r>
+    </w:p>
+    <w:p>
+      <w:pPr>
+        <w:spacing w:after="160" w:line="360"/>
+        <w:jc w:val="both"/>
+      </w:pPr>
+      <w:r>
+        <w:t xml:space="preserve">Además, en el siglo XIX se creía que todo se podía explicar físicamente. En medicina, si alguien sufría de histeria, se pensaba que había que encontrar una lesión orgánica. Freud viene de esa formación médica, pero al estudiar la histeria descubrirá que hay algo que no se explica solo por el cuerpo.</w:t>
       </w:r>
     </w:p>
     <w:p>
@@ -63,34 +108,142 @@
         <w:pStyle w:val="Heading1"/>
       </w:pPr>
       <w:r>
-        <w:t xml:space="preserve">2. Autores que le preceden</w:t>
-      </w:r>
-    </w:p>
-    <w:p>
-      <w:pPr>
-        <w:spacing w:after="160" w:line="360"/>
-        <w:jc w:val="both"/>
-      </w:pPr>
-      <w:r>
-        <w:t xml:space="preserve">En el siglo XIX se creía que todo se podía explicar físicamente, y la medicina buscaba siempre una lesión orgánica. Freud viene de esa formación (Brücke) y por eso habla de la mente como cargas y descargas de energía.</w:t>
-      </w:r>
-    </w:p>
-    <w:p>
-      <w:pPr>
-        <w:spacing w:after="160" w:line="360"/>
-        <w:jc w:val="both"/>
-      </w:pPr>
-      <w:r>
-        <w:t xml:space="preserve">Charcot le enseña que la histeria es una enfermedad real y que con la hipnosis se pueden provocar y quitar los síntomas. Breuer le muestra que cuando la paciente recuerda el trauma, el síntoma desaparece: "los histéricos sufren de reminiscencias".</w:t>
-      </w:r>
-    </w:p>
-    <w:p>
-      <w:pPr>
-        <w:spacing w:after="160" w:line="360"/>
-        <w:jc w:val="both"/>
-      </w:pPr>
-      <w:r>
-        <w:t xml:space="preserve">Darwin presenta al hombre como un animal más movido por instintos. Freud se pone a la altura de Copérnico y Darwin con las tres humillaciones (Una dificultad del psicoanálisis, 1917): Copérnico descubre que la Tierra no es el centro del universo, Darwin que el ser humano no es especial y Freud que el hombre ni siquiera es dueño de su propia mente.</w:t>
+        <w:t xml:space="preserve">2. Explique la doctrina de Freud: el inconsciente, las dos tópicas y las pulsiones</w:t>
+      </w:r>
+    </w:p>
+    <w:p>
+      <w:pPr>
+        <w:spacing w:after="160" w:line="360"/>
+        <w:jc w:val="both"/>
+      </w:pPr>
+      <w:r>
+        <w:t xml:space="preserve">Freud empieza estudiando la histeria, sobre todo en mujeres. Las pacientes tenían síntomas físicos, como parálisis o cegueras, pero no tenían ninguna lesión orgánica. Freud concluye que los histéricos sufren de reminiscencias, es decir, de recuerdos: hay una realidad psíquica que produce efectos en el cuerpo.</w:t>
+      </w:r>
+    </w:p>
+    <w:p>
+      <w:pPr>
+        <w:spacing w:after="160" w:line="360"/>
+        <w:jc w:val="both"/>
+      </w:pPr>
+      <w:r>
+        <w:t xml:space="preserve">Cuando empieza a estudiar la mente propone una primera tópica, una primera clasificación: nuestra mente no es unitaria, sino que trabaja por capas. La primera capa es el consciente, donde están aquellos recuerdos a los que tenemos acceso directo. La segunda es el preconsciente: son recuerdos que no están presentes en ese momento, pero que son fácilmente recuperables. La tercera es el inconsciente, una zona donde están todos los recuerdos a los que no podemos acceder. Sin embargo, estos recuerdos producen descargas de energía que nos hacen actuar o ser como somos.</w:t>
+      </w:r>
+    </w:p>
+    <w:p>
+      <w:pPr>
+        <w:spacing w:after="160" w:line="360"/>
+        <w:jc w:val="both"/>
+      </w:pPr>
+      <w:r>
+        <w:t xml:space="preserve">Según Freud, nuestra mente tiene esta última capa como mecanismo de defensa. Los recuerdos traumáticos, que serían imposibles de llevar en el consciente, se llevan al inconsciente. A este mecanismo lo llama represión. Aun así, estos recuerdos vuelven disfrazados: lo reprimido sigue activo y operante, y se manifiesta en los síntomas de la enfermedad. Por eso, para Freud, lo que tienen las personas enfermas no es un fallo nervioso, sino un mensaje cifrado de su inconsciente que quiere manifestarse.</w:t>
+      </w:r>
+    </w:p>
+    <w:p>
+      <w:pPr>
+        <w:spacing w:after="160" w:line="360"/>
+        <w:jc w:val="both"/>
+      </w:pPr>
+      <w:r>
+        <w:t xml:space="preserve">Freud distingue entre las neurosis (histeria, obsesión o compulsión y fobias), las psicosis (como la paranoia o la esquizofrenia) y las perversiones. Su estudio se centra sobre todo en las neurosis.</w:t>
+      </w:r>
+    </w:p>
+    <w:p>
+      <w:pPr>
+        <w:spacing w:after="160" w:line="360"/>
+        <w:jc w:val="both"/>
+      </w:pPr>
+      <w:r>
+        <w:t xml:space="preserve">Entonces surge una pregunta: si lo reprimido sigue activo, ¿cómo se manifiesta en las personas sanas? ¿Por qué no es todo el mundo histérico? Freud lo desarrolla en Psicopatología de la vida cotidiana. Podemos acceder de manera indirecta al inconsciente de tres formas. La primera es lo que él llama la vía regia: los sueños. Cuando dormimos, el consciente se relaja y el inconsciente se cuela. El sueño es la realización disfrazada de un deseo oculto, un compromiso entre el deseo y la censura. La segunda son los actos fallidos, como los lapsus al hablar o escribir, los objetos perdidos o las torpezas: por un despiste, el inconsciente se manifiesta en el consciente. La tercera son los chistes tendenciosos, que buscan burlar la censura para expresar los verdaderos deseos.</w:t>
+      </w:r>
+    </w:p>
+    <w:p>
+      <w:pPr>
+        <w:spacing w:after="160" w:line="360"/>
+        <w:jc w:val="both"/>
+      </w:pPr>
+      <w:r>
+        <w:t xml:space="preserve">Para Freud todavía más importante que estas manifestaciones es saber interpretarlas. Para eso está el psicoanálisis: el paciente habla libremente, diciendo todo lo que se le ocurra (asociación libre), y el terapeuta le escucha y toma notas sin dar más importancia a una cosa que a otra (atención parejamente flotante), para descifrar lo que hay detrás.</w:t>
+      </w:r>
+    </w:p>
+    <w:p>
+      <w:pPr>
+        <w:spacing w:after="160" w:line="360"/>
+        <w:jc w:val="both"/>
+      </w:pPr>
+      <w:r>
+        <w:t xml:space="preserve">Freud cree que nuestro aparato psíquico tiene que descargar su tensión y busca la satisfacción inmediata: es el principio del placer. Pero la experiencia nos enseña a posponer el placer, a tener en cuenta la realidad y a encontrar el camino más seguro: es el principio de realidad.</w:t>
+      </w:r>
+    </w:p>
+    <w:p>
+      <w:pPr>
+        <w:spacing w:after="160" w:line="360"/>
+        <w:jc w:val="both"/>
+      </w:pPr>
+      <w:r>
+        <w:t xml:space="preserve">En la pulsión sexual distingue cuatro elementos: la fuente, que es la zona del cuerpo donde se origina la excitación (zona erógena); el esfuerzo, que es la cantidad de presión que ejerce; la meta, que es la satisfacción, es decir, liberar esa presión; y el objeto, que no está predeterminado y puede ser cualquiera. Para Freud sexual no es lo mismo que genital, sino toda búsqueda de placer corporal más allá de la necesidad. Por eso empieza a estudiar la sexualidad infantil y distingue varias fases en las que el niño va encontrando placer: la fase oral (0 a 1 año: chupar, incorporar), la fase anal (2 a 3 años: retener o expulsar), la fase fálica (3 a 5 años), la fase de latencia (de los 6 años a la pubertad, en la que la sexualidad se adormece) y la fase genital (desde la pubertad, cuando se dirige a otra persona). En la fase fálica aparece el complejo de Edipo: el niño se enamora del padre del sexo opuesto y siente rivalidad hacia el del mismo sexo, con la angustia de castración.</w:t>
+      </w:r>
+    </w:p>
+    <w:p>
+      <w:pPr>
+        <w:spacing w:after="160" w:line="360"/>
+        <w:jc w:val="both"/>
+      </w:pPr>
+      <w:r>
+        <w:t xml:space="preserve">Freud se encuentra entonces con un problema. Si no recordamos algunos acontecimientos traumáticos, ¿por qué no nos curamos cuando alguien nos los cuenta? Es el problema de la transferencia: el paciente traslada al terapeuta sus vivencias y sus problemas. La transferencia puede ser positiva (confianza, afecto) o negativa (hostilidad, venganza). Lo importante es que el paciente reviva el trauma en el presente, y de ahí sale la oportunidad del psicoanálisis. El terapeuta tiene que mantener la neutralidad y no satisfacer las necesidades afectivas del paciente mientras este vuelve a vivirlo todo.</w:t>
+      </w:r>
+    </w:p>
+    <w:p>
+      <w:pPr>
+        <w:spacing w:after="160" w:line="360"/>
+        <w:jc w:val="both"/>
+      </w:pPr>
+      <w:r>
+        <w:t xml:space="preserve">Después aparece el problema del narcisismo. La libido no solo se dirige a objetos externos, sino que puede dirigirse hacia el propio yo. El niño no abandona su narcisismo original, sino que lo proyecta hacia sus ideales. Y la conciencia moral actúa como un censor que mide la relación entre el yo y esos ideales. Aquí Freud se da cuenta de que el ser humano no siempre busca solo el placer, sino que también quiere cumplir con sus ideales.</w:t>
+      </w:r>
+    </w:p>
+    <w:p>
+      <w:pPr>
+        <w:spacing w:after="160" w:line="360"/>
+        <w:jc w:val="both"/>
+      </w:pPr>
+      <w:r>
+        <w:t xml:space="preserve">Poco a poco Freud encuentra que ciertas personas repiten sus traumas, como los soldados con neurosis de guerra, o el niño que juega a tirar y recuperar un carrete repitiendo algo desagradable. Es como si nos empeñáramos en hacernos daño. Si el aparato psíquico siempre buscara el placer, esto no tendría explicación. Por eso Freud da un giro y llega a un principio dual. Por un lado está Eros, la pulsión de vida, que reúne la pulsión de autoconservación y la pulsión sexual. Por otro lado está Thanatos, la pulsión de muerte: si la vida procede de lo inorgánico, es normal que haya un deseo de volver a ello. Hacia el exterior se manifiesta como agresividad y hacia el interior como masoquismo y autodestrucción. Por eso tenemos esa necesidad de repetición: quitarnos el placer para luego dárnoslo.</w:t>
+      </w:r>
+    </w:p>
+    <w:p>
+      <w:pPr>
+        <w:spacing w:after="160" w:line="360"/>
+        <w:jc w:val="both"/>
+      </w:pPr>
+      <w:r>
+        <w:t xml:space="preserve">Finalmente, en El yo y el ello (1923), Freud propone una segunda tópica, que no hay que relacionar con la primera: ya no habla de capas de la mente, sino de tres instancias. El ello es la instancia más antigua, la región de nuestra mente donde están los impulsos. Se rige por principios irracionales, es egoísta, no atiende a la moral y no conoce el tiempo ni la lógica. El superyó es donde está interiorizada nuestra conciencia moral: introyectamos las reglas sociales y nos formamos una imagen perfecta de nosotros mismos. El superyó nos controla y nos dice cómo deberíamos ser; es un juez cruel e implacable. Por último está el yo, o ego, que es una parte del ello modificada por el contacto con el mundo exterior. Controla la motricidad, la percepción y las defensas, y actúa como una instancia mediadora entre el superyó y el ello. El yo no se puede identificar sin más con el consciente, porque una parte de él también es inconsciente.</w:t>
+      </w:r>
+    </w:p>
+    <w:p>
+      <w:pPr>
+        <w:spacing w:after="160" w:line="360"/>
+        <w:jc w:val="both"/>
+      </w:pPr>
+      <w:r>
+        <w:t xml:space="preserve">Freud aplica todo esto a la cultura. En Tótem y tabú (1913) explica qué es un tabú: algo que tú puedes hacer pero no sabes por qué no. Para explicarlo propone un posible origen de la civilización, un mito científico. Al principio había una horda gobernada por un padre despótico que acaparaba a todas las mujeres. Los hermanos se unieron, lo mataron y lo devoraron. Pero como al mismo tiempo lo odiaban y lo amaban, apareció la culpa, y de ahí surgieron dos reglas: no matar al tótem, que sustituye al padre, y no unirse con mujeres del propio clan. La civilización humana ha surgido de un pecado imperdonable, y esa culpa se transmite a lo largo de las generaciones hasta hoy. Por eso toda la sociedad humana es traumática y nos causa angustia y culpa. Con el tiempo el tótem se convierte en Dios.</w:t>
+      </w:r>
+    </w:p>
+    <w:p>
+      <w:pPr>
+        <w:spacing w:after="160" w:line="360"/>
+        <w:jc w:val="both"/>
+      </w:pPr>
+      <w:r>
+        <w:t xml:space="preserve">En El porvenir de una ilusión (1927) dice que la religión es una ilusión. El adulto recrea una situación infantil y sustituye al padre por una fantasía, que es Dios. Como la realidad nos da miedo, creamos dioses, y Dios cumple el papel del superyó. Freud confía en que algún día la humanidad madure y pueda quitarse la idea de Dios.</w:t>
+      </w:r>
+    </w:p>
+    <w:p>
+      <w:pPr>
+        <w:spacing w:after="160" w:line="360"/>
+        <w:jc w:val="both"/>
+      </w:pPr>
+      <w:r>
+        <w:t xml:space="preserve">En El malestar en la cultura (1930) dice que el hombre es un lobo para el hombre. La sociedad nos exige renunciar a ciertas pulsiones, y el precio que pagamos es una culpa cada vez mayor: cuanto más avanzamos en la cultura, más reprimidos estamos y más culpables nos sentimos. La única salida es la sublimación, que consiste en transformar esas descargas en algo aceptable, como el arte, la ciencia o la cultura. Pero no está al alcance de todos. Freud termina con una duda: ¿ganará Eros o ganará Thanatos?</w:t>
       </w:r>
     </w:p>
     <w:p>
@@ -98,61 +251,25 @@
         <w:pStyle w:val="Heading1"/>
       </w:pPr>
       <w:r>
-        <w:t xml:space="preserve">3. Síntesis de su doctrina</w:t>
-      </w:r>
-    </w:p>
-    <w:p>
-      <w:pPr>
-        <w:spacing w:after="160" w:line="360"/>
-        <w:jc w:val="both"/>
-      </w:pPr>
-      <w:r>
-        <w:t xml:space="preserve">Freud estudia la histeria: había síntomas físicos sin ninguna lesión orgánica, así que tenía que haber una realidad psíquica. Propone una primera tópica: la mente no es unitaria sino que trabaja por capas. El consciente son los recuerdos de acceso directo. El preconsciente son recuerdos que no están presentes pero se recuperan fácilmente. El inconsciente es donde están los recuerdos a los que no podemos acceder, pero que producen cargas de energía que nos hacen actuar como somos.</w:t>
-      </w:r>
-    </w:p>
-    <w:p>
-      <w:pPr>
-        <w:spacing w:after="160" w:line="360"/>
-        <w:jc w:val="both"/>
-      </w:pPr>
-      <w:r>
-        <w:t xml:space="preserve">Los recuerdos traumáticos que no podemos soportar se llevan al inconsciente como mecanismo de defensa: es la represión. Pero lo reprimido sigue activo y vuelve disfrazado. Por eso la enfermedad no es un fallo nervioso sino un mensaje cifrado del inconsciente. Si lo reprimido está activo, ¿cómo se manifiesta en las personas sanas? Por tres caminos: los sueños (la vía regia, la realización disfrazada de un deseo oculto), los lapsus y los chistes tendenciosos, que buscan burlar la censura. Lo importante es saber interpretarlos, y eso hace el psicoanálisis: el paciente habla libremente y el terapeuta escucha.</w:t>
-      </w:r>
-    </w:p>
-    <w:p>
-      <w:pPr>
-        <w:spacing w:after="160" w:line="360"/>
-        <w:jc w:val="both"/>
-      </w:pPr>
-      <w:r>
-        <w:t xml:space="preserve">El aparato psíquico busca descargar la tensión y la satisfacción inmediata (principio del placer), pero la vida nos enseña a posponer el placer (principio de realidad). En la pulsión distingue la fuente (la zona), el esfuerzo, la meta (liberar la presión) y el objeto (que puede ser cualquiera). Por eso estudia la sexualidad infantil, con sus fases: oral, anal, fálica (complejo de Edipo), latencia y genital.</w:t>
-      </w:r>
-    </w:p>
-    <w:p>
-      <w:pPr>
-        <w:spacing w:after="160" w:line="360"/>
-        <w:jc w:val="both"/>
-      </w:pPr>
-      <w:r>
-        <w:t xml:space="preserve">Le aparece el problema de la transferencia: el paciente traslada sus problemas al terapeuta. Es importante que el paciente reviva el trauma, y el terapeuta tiene que mantener la neutralidad. Con las neurosis de guerra ve que hay personas que repiten sus traumas, que nos empeñamos en hacernos daño. Por eso añade a Eros (pulsión de vida) el Thanatos (pulsión de muerte): si la vida viene de lo inorgánico, hay un deseo de volver a ello. Hacia fuera es agresividad y hacia dentro masoquismo y autodestrucción.</w:t>
-      </w:r>
-    </w:p>
-    <w:p>
-      <w:pPr>
-        <w:spacing w:after="160" w:line="360"/>
-        <w:jc w:val="both"/>
-      </w:pPr>
-      <w:r>
-        <w:t xml:space="preserve">La segunda tópica (que no hay que mezclar con la primera) es: el ello, la parte más antigua e irracional, egoísta, que no conoce el tiempo ni la moral; el superyó, donde hemos interiorizado las reglas sociales y que nos dice cómo deberíamos ser; y el yo, que actúa como mediador entre los dos.</w:t>
-      </w:r>
-    </w:p>
-    <w:p>
-      <w:pPr>
-        <w:spacing w:after="160" w:line="360"/>
-        <w:jc w:val="both"/>
-      </w:pPr>
-      <w:r>
-        <w:t xml:space="preserve">Sobre la cultura: en Tótem y tabú (1913) dice que la civilización nace de que los hermanos matan al padre que acaparaba a todas las mujeres, y esa culpa se transmite por generaciones (tótem → Dios). En El porvenir de una ilusión (1927) dice que la religión es una ilusión que mantiene al adulto en un papel infantil, con Dios en el papel de padre. En El malestar en la cultura (1930) dice que el hombre es un lobo para el hombre: cuanta más cultura, más represión y más culpa. La única salida es la sublimación (el arte, la ciencia), pero no está al alcance de todos. Deja la duda de si ganará Eros o Thanatos.</w:t>
+        <w:t xml:space="preserve">3. Exponga por qué Freud puede considerarse un maestro de la sospecha</w:t>
+      </w:r>
+    </w:p>
+    <w:p>
+      <w:pPr>
+        <w:spacing w:after="160" w:line="360"/>
+        <w:jc w:val="both"/>
+      </w:pPr>
+      <w:r>
+        <w:t xml:space="preserve">Desde Descartes, la filosofía moderna confiaba en la conciencia como punto de partida seguro: si pienso, sé lo que pienso. Los maestros de la sospecha ponen en duda precisamente esa confianza. Para ellos, lo que creemos pensar o querer esconde algo que actúa por debajo.</w:t>
+      </w:r>
+    </w:p>
+    <w:p>
+      <w:pPr>
+        <w:spacing w:after="160" w:line="360"/>
+        <w:jc w:val="both"/>
+      </w:pPr>
+      <w:r>
+        <w:t xml:space="preserve">Freud es el caso más claro. Con la tercera humillación muestra que el hombre ni siquiera es dueño de su propia mente: lo que hacemos depende del inconsciente, de lo reprimido y de las pulsiones. Todo lo que produce la conciencia puede ser un disfraz: los síntomas, los sueños, los lapsus y los chistes, pero también la moral, que es el superyó, y la religión, que es una ilusión. Por eso el psicoanálisis no se fía de lo que el paciente dice a primera vista, sino que busca el sentido oculto que hay detrás. En Marx lo oculto son las relaciones económicas y en Nietzsche la voluntad de poder; en Freud es el inconsciente.</w:t>
       </w:r>
     </w:p>
     <w:p>
@@ -160,25 +277,43 @@
         <w:pStyle w:val="Heading1"/>
       </w:pPr>
       <w:r>
-        <w:t xml:space="preserve">4. Relación con Nietzsche</w:t>
-      </w:r>
-    </w:p>
-    <w:p>
-      <w:pPr>
-        <w:spacing w:after="160" w:line="360"/>
-        <w:jc w:val="both"/>
-      </w:pPr>
-      <w:r>
-        <w:t xml:space="preserve">Los dos son maestros de la sospecha. Nietzsche ya decía que la mayor parte del pensar consciente está guiado por los instintos, y Freud lo convierte en una teoría con el inconsciente y el ello (palabra que viene de Nietzsche). Para los dos la moral no es un conocimiento del bien sino algo que hay que desenmascarar: para Nietzsche es el resentimiento de los débiles y para Freud el superyó. Los dos critican la religión: Dios ha muerto para Nietzsche y es una ilusión para Freud.</w:t>
-      </w:r>
-    </w:p>
-    <w:p>
-      <w:pPr>
-        <w:spacing w:after="160" w:line="360"/>
-        <w:jc w:val="both"/>
-      </w:pPr>
-      <w:r>
-        <w:t xml:space="preserve">La diferencia es que Nietzsche defiende los instintos y la vida, mientras que Freud, como médico, quiere que el yo controle las pulsiones.</w:t>
+        <w:t xml:space="preserve">4. Exponga cómo influyó la obra de Freud (o su relación con otros autores)</w:t>
+      </w:r>
+    </w:p>
+    <w:p>
+      <w:pPr>
+        <w:spacing w:after="160" w:line="360"/>
+        <w:jc w:val="both"/>
+      </w:pPr>
+      <w:r>
+        <w:t xml:space="preserve">Simone de Beauvoir. Freud influye en el feminismo de Simone de Beauvoir. Para ella la mujer se tiene que liberar de sus traumas, y entre el feminismo y el freudismo hay un punto en común que conduce a pensar el género y la orientación sexual como algo que se construye.</w:t>
+      </w:r>
+    </w:p>
+    <w:p>
+      <w:pPr>
+        <w:spacing w:after="160" w:line="360"/>
+        <w:jc w:val="both"/>
+      </w:pPr>
+      <w:r>
+        <w:t xml:space="preserve">John Money. Va más lejos: para él las categorías son traumas, incluso el género, la heterosexualidad y la homosexualidad. Es decir, no serían algo natural, sino el resultado de lo que se ha vivido.</w:t>
+      </w:r>
+    </w:p>
+    <w:p>
+      <w:pPr>
+        <w:spacing w:after="160" w:line="360"/>
+        <w:jc w:val="both"/>
+      </w:pPr>
+      <w:r>
+        <w:t xml:space="preserve">Nietzsche y Freud. Los dos son maestros de la sospecha. Nietzsche ya decía que la mayor parte del pensar consciente está guiada por los instintos, y Freud lo convierte en una teoría con el inconsciente y el ello. Para los dos la moral no es un conocimiento del bien: para Nietzsche es el resentimiento de los débiles y para Freud el superyó. Los dos critican la religión: para Nietzsche Dios ha muerto y para Freud es una ilusión. La diferencia es que Nietzsche defiende los instintos y la vida, mientras que Freud, como médico, quiere que el yo controle las pulsiones.</w:t>
+      </w:r>
+    </w:p>
+    <w:p>
+      <w:pPr>
+        <w:spacing w:after="160" w:line="360"/>
+        <w:jc w:val="both"/>
+      </w:pPr>
+      <w:r>
+        <w:t xml:space="preserve">Sartre y Freud. Los dos se preguntan por qué actuamos como actuamos, pero llegan a respuestas opuestas. Para Freud dependemos de un inconsciente que no controlamos. Para Sartre eso sería una excusa: el hombre está condenado a ser libre, y escudarse en que algo dentro de mí me obliga sería mala fe.</w:t>
       </w:r>
     </w:p>
     <w:p>
@@ -195,34 +330,43 @@
         <w:jc w:val="both"/>
       </w:pPr>
       <w:r>
-        <w:t xml:space="preserve">Freud tiene el mérito de ser el padre de la psicología moderna y de mostrar que no siempre nos conocemos del todo. Pero hay que preguntarse: si el ser humano es un ser racional, ¿qué significa ser racional? No es solo conocer, porque los animales también conocen, ni encadenar razonamientos, porque las máquinas también pueden. Una parte de ser racional es controlar los propios impulsos, y Freud niega que podamos hacerlo.</w:t>
-      </w:r>
-    </w:p>
-    <w:p>
-      <w:pPr>
-        <w:spacing w:after="160" w:line="360"/>
-        <w:jc w:val="both"/>
-      </w:pPr>
-      <w:r>
-        <w:t xml:space="preserve">Sin embargo, el psicoanálisis busca que el paciente se dé cuenta de lo reprimido y lo entienda, así que confía en la razón. Freud demuestra que la razón no lo puede todo, no que no pueda nada.</w:t>
-      </w:r>
-    </w:p>
-    <w:p>
-      <w:pPr>
-        <w:spacing w:after="160" w:line="360"/>
-        <w:jc w:val="both"/>
-      </w:pPr>
-      <w:r>
-        <w:t xml:space="preserve">Además es curioso que sea el padre de la psico-logía (psyché = alma). Los seres inertes son movidos desde fuera, su unidad es de conjunto y no tienen interioridad. Los seres vivos se mueven a sí mismos, tienen unidad orgánica e interioridad, tienen alma. Freud describe al hombre como algo movido por fuerzas, más parecido a lo inerte que a lo vivo.</w:t>
-      </w:r>
-    </w:p>
-    <w:p>
-      <w:pPr>
-        <w:spacing w:after="160" w:line="360"/>
-        <w:jc w:val="both"/>
-      </w:pPr>
-      <w:r>
-        <w:t xml:space="preserve">Ser humano es todo miembro de la especie homo sapiens sapiens. Persona es un ser único e irrepetible con dignidad. La palabra viene del teatro y en Roma no todos eran personas. Santo Tomás coge la definición de Boecio: sustancia individual de naturaleza racional. En la escala de los seres, los inertes son, los vivos son y viven, y los humanos son, viven y entienden. La inteligencia no es algo añadido sino el ser de los seres vivos inteligentes. Por eso la persona va unida al ser y de ahí sale su dignidad: no depende de que controle sus impulsos ni de su salud mental, la tiene por el simple hecho de ser.</w:t>
+        <w:t xml:space="preserve">Freud tiene el mérito de ser considerado el padre de la psicología moderna y de habernos mostrado que no siempre nos conocemos del todo. Pero para valorar su obra hay que centrarse en una idea: el ser humano es un ser racional. ¿Qué significa ser racional? No es solo conocer, porque los animales también conocen. Tampoco es elaborar juicios, porque las máquinas también pueden encadenar razonamientos. Tampoco es conocer la verdad, porque nadie puede decir que la posee por completo. Una parte importante de ser racional es controlar los propios impulsos, y eso es justo lo que Freud parece haber negado.</w:t>
+      </w:r>
+    </w:p>
+    <w:p>
+      <w:pPr>
+        <w:spacing w:after="160" w:line="360"/>
+        <w:jc w:val="both"/>
+      </w:pPr>
+      <w:r>
+        <w:t xml:space="preserve">Sin embargo, el psicoanálisis busca que el paciente se dé cuenta de lo que tiene reprimido y lo entienda. Es decir, confía en que la razón puede iluminar e integrar los impulsos. Freud demuestra que la razón no lo puede todo, pero no que no pueda nada.</w:t>
+      </w:r>
+    </w:p>
+    <w:p>
+      <w:pPr>
+        <w:spacing w:after="160" w:line="360"/>
+        <w:jc w:val="both"/>
+      </w:pPr>
+      <w:r>
+        <w:t xml:space="preserve">Además, es curioso que Freud sea el padre de la psicología, porque psicología viene de psyché, que significa alma, y desde los orígenes del pensamiento se distingue entre el alma y el cuerpo. Los seres inertes se caracterizan por el heteromatismo: más que moverse, son movidos; su unidad es una unidad de conjunto y no tienen interioridad. Los seres vivos, en cambio, se caracterizan por el automatismo: se mueven a sí mismos, su unidad es orgánica y tienen interioridad, es decir, tienen alma. Aunque Freud niegue que podamos controlar los impulsos, describe al ser humano como algo movido por fuerzas, que se parece más a un ser inerte que a un ser vivo con autonomía.</w:t>
+      </w:r>
+    </w:p>
+    <w:p>
+      <w:pPr>
+        <w:spacing w:after="160" w:line="360"/>
+        <w:jc w:val="both"/>
+      </w:pPr>
+      <w:r>
+        <w:t xml:space="preserve">Esto nos lleva otra vez a la pregunta por el ser. Aristóteles explica que el ser se dice de muchas maneras y que hay grados de ser: los seres inertes son, los seres vivos son y viven, y los seres humanos son, viven y entienden. La vida es el ser de los seres vivos y la inteligencia es el ser de los seres vivos inteligentes. Por tanto, la racionalidad no es una capa fina por encima de las pulsiones, sino la manera de ser del ser humano.</w:t>
+      </w:r>
+    </w:p>
+    <w:p>
+      <w:pPr>
+        <w:spacing w:after="160" w:line="360"/>
+        <w:jc w:val="both"/>
+      </w:pPr>
+      <w:r>
+        <w:t xml:space="preserve">Ser humano es todo miembro de la especie homo sapiens sapiens. Persona es un ser único e irrepetible, con dignidad. La palabra viene del teatro, donde la persona era la máscara o el personaje, y antiguamente no todos se consideraban personas: en Roma solo el hombre libre, romano y paterfamilias. Santo Tomás de Aquino coge la definición de Boecio: persona es una sustancia individual de naturaleza racional. Entonces la persona va necesariamente unida al ser, y de ahí existe la dignidad humana: sin ser no existe. Es una dignidad ontológica, que no depende de que controlemos nuestros impulsos ni de nuestra salud psíquica, sino que se tiene por el simple hecho de ser. Los seres humanos somos racionales y libres.</w:t>
       </w:r>
     </w:p>
     <w:p>
@@ -248,124 +392,215 @@
         <w:spacing w:after="100" w:line="320"/>
       </w:pPr>
       <w:r>
-        <w:t xml:space="preserve">Maestros de la sospecha (Ricoeur): Marx, Nietzsche, Freud.</w:t>
-      </w:r>
-    </w:p>
-    <w:p>
-      <w:pPr>
-        <w:pStyle w:val="ListParagraph"/>
-        <w:numPr>
-          <w:ilvl w:val="0"/>
-          <w:numId w:val="2"/>
-        </w:numPr>
-        <w:spacing w:after="100" w:line="320"/>
-      </w:pPr>
-      <w:r>
-        <w:t xml:space="preserve">Contexto: fin del Sacro Imperio (1806), Prusia vs Austria, Austria-Hungría (1867), Viena, I Guerra Mundial, nazismo, huye a Londres.</w:t>
-      </w:r>
-    </w:p>
-    <w:p>
-      <w:pPr>
-        <w:pStyle w:val="ListParagraph"/>
-        <w:numPr>
-          <w:ilvl w:val="0"/>
-          <w:numId w:val="2"/>
-        </w:numPr>
-        <w:spacing w:after="100" w:line="320"/>
-      </w:pPr>
-      <w:r>
-        <w:t xml:space="preserve">Brücke, Breuer (histeria, hipnosis), Charcot. 3 humillaciones: Copérnico, Darwin, Freud.</w:t>
-      </w:r>
-    </w:p>
-    <w:p>
-      <w:pPr>
-        <w:pStyle w:val="ListParagraph"/>
-        <w:numPr>
-          <w:ilvl w:val="0"/>
-          <w:numId w:val="2"/>
-        </w:numPr>
-        <w:spacing w:after="100" w:line="320"/>
-      </w:pPr>
-      <w:r>
-        <w:t xml:space="preserve">1ª tópica: consciente / preconsciente / inconsciente. Represión. Lo reprimido vuelve disfrazado = mensaje cifrado.</w:t>
-      </w:r>
-    </w:p>
-    <w:p>
-      <w:pPr>
-        <w:pStyle w:val="ListParagraph"/>
-        <w:numPr>
-          <w:ilvl w:val="0"/>
-          <w:numId w:val="2"/>
-        </w:numPr>
-        <w:spacing w:after="100" w:line="320"/>
-      </w:pPr>
-      <w:r>
-        <w:t xml:space="preserve">3 caminos: sueños (vía regia), lapsus, chistes.</w:t>
-      </w:r>
-    </w:p>
-    <w:p>
-      <w:pPr>
-        <w:pStyle w:val="ListParagraph"/>
-        <w:numPr>
-          <w:ilvl w:val="0"/>
-          <w:numId w:val="2"/>
-        </w:numPr>
-        <w:spacing w:after="100" w:line="320"/>
-      </w:pPr>
-      <w:r>
-        <w:t xml:space="preserve">Principio del placer / principio de realidad. Pulsión: fuente, esfuerzo, meta, objeto. Fases: oral, anal, fálica (Edipo), latencia, genital.</w:t>
-      </w:r>
-    </w:p>
-    <w:p>
-      <w:pPr>
-        <w:pStyle w:val="ListParagraph"/>
-        <w:numPr>
-          <w:ilvl w:val="0"/>
-          <w:numId w:val="2"/>
-        </w:numPr>
-        <w:spacing w:after="100" w:line="320"/>
-      </w:pPr>
-      <w:r>
-        <w:t xml:space="preserve">Transferencia. Eros (vida) / Thanatos (muerte).</w:t>
-      </w:r>
-    </w:p>
-    <w:p>
-      <w:pPr>
-        <w:pStyle w:val="ListParagraph"/>
-        <w:numPr>
-          <w:ilvl w:val="0"/>
-          <w:numId w:val="2"/>
-        </w:numPr>
-        <w:spacing w:after="100" w:line="320"/>
-      </w:pPr>
-      <w:r>
-        <w:t xml:space="preserve">2ª tópica: ello / yo / superyó (no mezclar con la 1ª).</w:t>
-      </w:r>
-    </w:p>
-    <w:p>
-      <w:pPr>
-        <w:pStyle w:val="ListParagraph"/>
-        <w:numPr>
-          <w:ilvl w:val="0"/>
-          <w:numId w:val="2"/>
-        </w:numPr>
-        <w:spacing w:after="100" w:line="320"/>
-      </w:pPr>
-      <w:r>
-        <w:t xml:space="preserve">Tótem y tabú (culpa), El porvenir de una ilusión (religión = ilusión), El malestar en la cultura (más cultura, más culpa; sublimación).</w:t>
-      </w:r>
-    </w:p>
-    <w:p>
-      <w:pPr>
-        <w:pStyle w:val="ListParagraph"/>
-        <w:numPr>
-          <w:ilvl w:val="0"/>
-          <w:numId w:val="2"/>
-        </w:numPr>
-        <w:spacing w:after="100" w:line="320"/>
-      </w:pPr>
-      <w:r>
-        <w:t xml:space="preserve">Crítica: ser racional = controlar impulsos; el psicoanálisis confía en la razón; inerte vs vivo; persona (Boecio) → dignidad ontológica.</w:t>
+        <w:t xml:space="preserve">Maestros de la sospecha (Ricoeur, 1965): Marx, Nietzsche, Freud.</w:t>
+      </w:r>
+    </w:p>
+    <w:p>
+      <w:pPr>
+        <w:pStyle w:val="ListParagraph"/>
+        <w:numPr>
+          <w:ilvl w:val="0"/>
+          <w:numId w:val="2"/>
+        </w:numPr>
+        <w:spacing w:after="100" w:line="320"/>
+      </w:pPr>
+      <w:r>
+        <w:t xml:space="preserve">Bio: familia judía de origen checo (Imperio austriaco) → Viena; Brücke (neuronas), Breuer (histeria, hipnosis), Charcot (París); psicoanálisis; huye a Londres por el nazismo; muere en 1939.</w:t>
+      </w:r>
+    </w:p>
+    <w:p>
+      <w:pPr>
+        <w:pStyle w:val="ListParagraph"/>
+        <w:numPr>
+          <w:ilvl w:val="0"/>
+          <w:numId w:val="2"/>
+        </w:numPr>
+        <w:spacing w:after="100" w:line="320"/>
+      </w:pPr>
+      <w:r>
+        <w:t xml:space="preserve">Obras: Estudios sobre la histeria (1895), La interpretación de los sueños (1900), Psicopatología de la vida cotidiana (1901), Tres ensayos (1905), Tótem y tabú (1913), Lo inconsciente (1915), Más allá del principio del placer (1920), El yo y el ello (1923), El malestar en la cultura (1930).</w:t>
+      </w:r>
+    </w:p>
+    <w:p>
+      <w:pPr>
+        <w:pStyle w:val="ListParagraph"/>
+        <w:numPr>
+          <w:ilvl w:val="0"/>
+          <w:numId w:val="2"/>
+        </w:numPr>
+        <w:spacing w:after="100" w:line="320"/>
+      </w:pPr>
+      <w:r>
+        <w:t xml:space="preserve">3 humillaciones (Una dificultad del psicoanálisis, 1917): Copérnico (no somos el centro del universo), Darwin (el ser humano no es especial), Freud (no es dueño de su propia mente).</w:t>
+      </w:r>
+    </w:p>
+    <w:p>
+      <w:pPr>
+        <w:pStyle w:val="ListParagraph"/>
+        <w:numPr>
+          <w:ilvl w:val="0"/>
+          <w:numId w:val="2"/>
+        </w:numPr>
+        <w:spacing w:after="100" w:line="320"/>
+      </w:pPr>
+      <w:r>
+        <w:t xml:space="preserve">Histeria: síntomas sin lesión → realidad psíquica; los histéricos sufren de reminiscencias.</w:t>
+      </w:r>
+    </w:p>
+    <w:p>
+      <w:pPr>
+        <w:pStyle w:val="ListParagraph"/>
+        <w:numPr>
+          <w:ilvl w:val="0"/>
+          <w:numId w:val="2"/>
+        </w:numPr>
+        <w:spacing w:after="100" w:line="320"/>
+      </w:pPr>
+      <w:r>
+        <w:t xml:space="preserve">1ª tópica: consciente (acceso directo) / preconsciente (fácil de recuperar) / inconsciente (inaccesible, pero produce descargas de energía).</w:t>
+      </w:r>
+    </w:p>
+    <w:p>
+      <w:pPr>
+        <w:pStyle w:val="ListParagraph"/>
+        <w:numPr>
+          <w:ilvl w:val="0"/>
+          <w:numId w:val="2"/>
+        </w:numPr>
+        <w:spacing w:after="100" w:line="320"/>
+      </w:pPr>
+      <w:r>
+        <w:t xml:space="preserve">Represión = mecanismo de defensa. Lo reprimido sigue activo, vuelve disfrazado → la enfermedad es un mensaje cifrado.</w:t>
+      </w:r>
+    </w:p>
+    <w:p>
+      <w:pPr>
+        <w:pStyle w:val="ListParagraph"/>
+        <w:numPr>
+          <w:ilvl w:val="0"/>
+          <w:numId w:val="2"/>
+        </w:numPr>
+        <w:spacing w:after="100" w:line="320"/>
+      </w:pPr>
+      <w:r>
+        <w:t xml:space="preserve">Neurosis (histeria, obsesión, fobias), psicosis (paranoia, esquizofrenia), perversiones.</w:t>
+      </w:r>
+    </w:p>
+    <w:p>
+      <w:pPr>
+        <w:pStyle w:val="ListParagraph"/>
+        <w:numPr>
+          <w:ilvl w:val="0"/>
+          <w:numId w:val="2"/>
+        </w:numPr>
+        <w:spacing w:after="100" w:line="320"/>
+      </w:pPr>
+      <w:r>
+        <w:t xml:space="preserve">3 caminos en personas sanas: sueños (vía regia), actos fallidos (lapsus), chistes tendenciosos. Psicoanálisis: asociación libre + atención flotante.</w:t>
+      </w:r>
+    </w:p>
+    <w:p>
+      <w:pPr>
+        <w:pStyle w:val="ListParagraph"/>
+        <w:numPr>
+          <w:ilvl w:val="0"/>
+          <w:numId w:val="2"/>
+        </w:numPr>
+        <w:spacing w:after="100" w:line="320"/>
+      </w:pPr>
+      <w:r>
+        <w:t xml:space="preserve">Principio del placer / principio de realidad. Pulsión: fuente, esfuerzo, meta, objeto.</w:t>
+      </w:r>
+    </w:p>
+    <w:p>
+      <w:pPr>
+        <w:pStyle w:val="ListParagraph"/>
+        <w:numPr>
+          <w:ilvl w:val="0"/>
+          <w:numId w:val="2"/>
+        </w:numPr>
+        <w:spacing w:after="100" w:line="320"/>
+      </w:pPr>
+      <w:r>
+        <w:t xml:space="preserve">Sexualidad infantil: oral, anal, fálica (Edipo), latencia, genital.</w:t>
+      </w:r>
+    </w:p>
+    <w:p>
+      <w:pPr>
+        <w:pStyle w:val="ListParagraph"/>
+        <w:numPr>
+          <w:ilvl w:val="0"/>
+          <w:numId w:val="2"/>
+        </w:numPr>
+        <w:spacing w:after="100" w:line="320"/>
+      </w:pPr>
+      <w:r>
+        <w:t xml:space="preserve">Transferencia: revivir el trauma; neutralidad del terapeuta. Narcisismo: el niño proyecta su narcisismo en ideales.</w:t>
+      </w:r>
+    </w:p>
+    <w:p>
+      <w:pPr>
+        <w:pStyle w:val="ListParagraph"/>
+        <w:numPr>
+          <w:ilvl w:val="0"/>
+          <w:numId w:val="2"/>
+        </w:numPr>
+        <w:spacing w:after="100" w:line="320"/>
+      </w:pPr>
+      <w:r>
+        <w:t xml:space="preserve">Repetición de traumas → Eros (vida) / Thanatos (muerte: agresividad hacia fuera, masoquismo hacia dentro).</w:t>
+      </w:r>
+    </w:p>
+    <w:p>
+      <w:pPr>
+        <w:pStyle w:val="ListParagraph"/>
+        <w:numPr>
+          <w:ilvl w:val="0"/>
+          <w:numId w:val="2"/>
+        </w:numPr>
+        <w:spacing w:after="100" w:line="320"/>
+      </w:pPr>
+      <w:r>
+        <w:t xml:space="preserve">2ª tópica (¡no relacionarla con la 1ª!): ello (antiguo, irracional, egoísta, sin tiempo ni moral) / superyó (normas interiorizadas, imagen perfecta, juez cruel) / yo (mediador, controla la motricidad).</w:t>
+      </w:r>
+    </w:p>
+    <w:p>
+      <w:pPr>
+        <w:pStyle w:val="ListParagraph"/>
+        <w:numPr>
+          <w:ilvl w:val="0"/>
+          <w:numId w:val="2"/>
+        </w:numPr>
+        <w:spacing w:after="100" w:line="320"/>
+      </w:pPr>
+      <w:r>
+        <w:t xml:space="preserve">Tótem y tabú (horda, parricidio, culpa, tótem → Dios), El porvenir de una ilusión (religión = ilusión, Dios = padre), El malestar en la cultura (homo homini lupus, más cultura = más culpa, sublimación, ¿Eros o Thanatos?).</w:t>
+      </w:r>
+    </w:p>
+    <w:p>
+      <w:pPr>
+        <w:pStyle w:val="ListParagraph"/>
+        <w:numPr>
+          <w:ilvl w:val="0"/>
+          <w:numId w:val="2"/>
+        </w:numPr>
+        <w:spacing w:after="100" w:line="320"/>
+      </w:pPr>
+      <w:r>
+        <w:t xml:space="preserve">Influencia: Simone de Beauvoir, John Money. Relación con Nietzsche y Sartre.</w:t>
+      </w:r>
+    </w:p>
+    <w:p>
+      <w:pPr>
+        <w:pStyle w:val="ListParagraph"/>
+        <w:numPr>
+          <w:ilvl w:val="0"/>
+          <w:numId w:val="2"/>
+        </w:numPr>
+        <w:spacing w:after="100" w:line="320"/>
+      </w:pPr>
+      <w:r>
+        <w:t xml:space="preserve">Crítica: ¿qué es ser racional? (conocer, juzgar, verdad, controlar impulsos); el psicoanálisis confía en la razón; psyché = alma; inerte (heteromatismo) vs vivo (automatismo); grados de ser; persona (Boecio) → dignidad ontológica.</w:t>
       </w:r>
     </w:p>
     <w:sectPr>

</xml_diff>

<commit_message>
Freud: reduce la doctrina y el comentario crítico
Co-Authored-By: Claude Opus 5.5 <noreply@anthropic.com>
Claude-Session: https://claude.ai/code/session_01Fj7SZp3YYQfX9U1XL9NLBt
</commit_message>
<xml_diff>
--- a/formacion-general/hombre-y-mundo-moderno/apuntes-word/Freud.docx
+++ b/formacion-general/hombre-y-mundo-moderno/apuntes-word/Freud.docx
@@ -138,26 +138,10 @@
           <w:b/>
           <w:bCs/>
         </w:rPr>
-        <w:t xml:space="preserve">El punto de partida: la histeria. </w:t>
-      </w:r>
-      <w:r>
-        <w:t xml:space="preserve">Freud empieza estudiando la histeria, sobre todo en mujeres. Las pacientes tenían síntomas físicos, como parálisis, cegueras o contracturas, pero no había ninguna lesión orgánica que los explicara. La medicina de su tiempo no sabía qué hacer con ellas. Freud concluye que hay una realidad psíquica capaz de producir efectos en el cuerpo. Al principio usa la hipnosis, como Breuer, pero después la abandona y pide al paciente que hable libremente.</w:t>
-      </w:r>
-    </w:p>
-    <w:p>
-      <w:pPr>
-        <w:spacing w:after="160" w:line="360"/>
-        <w:jc w:val="both"/>
-      </w:pPr>
-      <w:r>
-        <w:rPr>
-          <w:b/>
-          <w:bCs/>
-        </w:rPr>
-        <w:t xml:space="preserve">La primera tópica. </w:t>
-      </w:r>
-      <w:r>
-        <w:t xml:space="preserve">Cuando empieza a estudiar la mente propone una primera tópica, es decir, una primera clasificación de la mente. Nuestra mente no es unitaria, sino que trabaja por capas. La primera capa es el consciente, donde están aquellos recuerdos a los que tenemos acceso directo, lo que tenemos presente en cada momento. La segunda es el preconsciente: son recuerdos que no están presentes, pero que son fácilmente recuperables, como un nombre o algo que hicimos ayer. La tercera es el inconsciente, una zona donde están todos los recuerdos a los que no podemos acceder. Sin embargo, aunque no podamos acceder a ellos, producen descargas de energía que nos hacen actuar o ser como somos.</w:t>
+        <w:t xml:space="preserve">La histeria y la primera tópica. </w:t>
+      </w:r>
+      <w:r>
+        <w:t xml:space="preserve">Freud empieza estudiando la histeria, sobre todo en mujeres: tenían síntomas físicos, como parálisis o cegueras, pero ninguna lesión orgánica. Concluye que hay una realidad psíquica que produce efectos en el cuerpo. Para explicarlo propone una primera tópica, una primera clasificación de la mente: nuestra mente no es unitaria, sino que trabaja por capas. La primera capa es el consciente, donde están los recuerdos a los que tenemos acceso directo. La segunda es el preconsciente: recuerdos que no están presentes pero que son fácilmente recuperables. La tercera es el inconsciente, una zona donde están todos los recuerdos a los que no podemos acceder, pero que producen descargas de energía que nos hacen actuar o ser como somos.</w:t>
       </w:r>
     </w:p>
     <w:p>
@@ -173,135 +157,55 @@
         <w:t xml:space="preserve">La represión. </w:t>
       </w:r>
       <w:r>
-        <w:t xml:space="preserve">Según Freud, nuestra mente tiene esta última capa como mecanismo de defensa. Hay recuerdos traumáticos que serían imposibles de llevar en el consciente, porque no los podríamos soportar, y la mente los lleva al inconsciente. A este mecanismo lo llama represión. Pero lo reprimido no desaparece: sigue activo y operante, y tiende a volver. Como la censura no le deja volver tal cual, vuelve disfrazado, y esa forma disfrazada es el síntoma de la enfermedad. Por eso, para Freud, lo que tienen las personas enfermas no es un fallo nervioso, sino un mensaje cifrado de su inconsciente que quiere manifestarse. Esto es el descubrimiento del inconsciente.</w:t>
-      </w:r>
-    </w:p>
-    <w:p>
-      <w:pPr>
-        <w:spacing w:after="160" w:line="360"/>
-        <w:jc w:val="both"/>
-      </w:pPr>
-      <w:r>
-        <w:rPr>
-          <w:b/>
-          <w:bCs/>
-        </w:rPr>
-        <w:t xml:space="preserve">Los trastornos. </w:t>
-      </w:r>
-      <w:r>
-        <w:t xml:space="preserve">Freud distingue entre las neurosis (la histeria, la obsesión o compulsión y las fobias), las psicosis (como la paranoia o la esquizofrenia) y las perversiones. Su estudio se centra sobre todo en las neurosis.</w:t>
-      </w:r>
-    </w:p>
-    <w:p>
-      <w:pPr>
-        <w:spacing w:after="160" w:line="360"/>
-        <w:jc w:val="both"/>
-      </w:pPr>
-      <w:r>
-        <w:rPr>
-          <w:b/>
-          <w:bCs/>
-        </w:rPr>
-        <w:t xml:space="preserve">El inconsciente en las personas sanas. </w:t>
-      </w:r>
-      <w:r>
-        <w:t xml:space="preserve">Entonces surge una pregunta: si lo reprimido sigue activo, ¿cómo se manifiesta en las personas sanas? ¿Por qué no es todo el mundo histérico? Freud lo desarrolla en Psicopatología de la vida cotidiana: todos tenemos un inconsciente, y podemos acceder a él de manera indirecta de tres formas. La primera es lo que él llama la vía regia: los sueños. Cuando dormimos el consciente se relaja y el inconsciente se cuela. El sueño es la realización disfrazada de un deseo oculto, y es un compromiso entre el deseo y la censura: el deseo se cumple, pero disfrazado para que la censura lo deje pasar. La segunda son los actos fallidos: los lapsus al hablar o escribir, los objetos que perdemos, las torpezas. Por un despiste, el inconsciente se manifiesta en el consciente. La tercera son los chistes tendenciosos, que buscan burlar la censura para expresar los verdaderos deseos, por ejemplo agresivos o sexuales, de una forma que se acepta socialmente.</w:t>
-      </w:r>
-    </w:p>
-    <w:p>
-      <w:pPr>
-        <w:spacing w:after="160" w:line="360"/>
-        <w:jc w:val="both"/>
-      </w:pPr>
-      <w:r>
-        <w:rPr>
-          <w:b/>
-          <w:bCs/>
-        </w:rPr>
-        <w:t xml:space="preserve">El psicoanálisis. </w:t>
-      </w:r>
-      <w:r>
-        <w:t xml:space="preserve">Para Freud todavía más importante que identificar estas manifestaciones es saber interpretarlas. Para eso está el psicoanálisis. El paciente habla libremente y dice todo lo que se le ocurra, aunque le parezca absurdo o vergonzoso: es la asociación libre. El terapeuta le escucha y toma notas sin dar más importancia a una cosa que a otra: es la atención parejamente flotante. Así va descifrando lo que hay detrás de lo que el paciente dice.</w:t>
-      </w:r>
-    </w:p>
-    <w:p>
-      <w:pPr>
-        <w:spacing w:after="160" w:line="360"/>
-        <w:jc w:val="both"/>
-      </w:pPr>
-      <w:r>
-        <w:rPr>
-          <w:b/>
-          <w:bCs/>
-        </w:rPr>
-        <w:t xml:space="preserve">Principio del placer y principio de realidad. </w:t>
-      </w:r>
-      <w:r>
-        <w:t xml:space="preserve">Freud cree que nuestro aparato psíquico tiene que descargar su tensión y busca la satisfacción inmediata: es el principio del placer. Pero la experiencia nos enseña a posponer el placer, a tener en cuenta la realidad y a encontrar el camino más seguro para satisfacernos: es el principio de realidad. Un niño pequeño quiere las cosas ya; un adulto aprende a esperar.</w:t>
-      </w:r>
-    </w:p>
-    <w:p>
-      <w:pPr>
-        <w:spacing w:after="160" w:line="360"/>
-        <w:jc w:val="both"/>
-      </w:pPr>
-      <w:r>
-        <w:rPr>
-          <w:b/>
-          <w:bCs/>
-        </w:rPr>
-        <w:t xml:space="preserve">La pulsión sexual. </w:t>
-      </w:r>
-      <w:r>
-        <w:t xml:space="preserve">En la pulsión sexual distingue cuatro elementos. La fuente es la zona del cuerpo donde se origina la excitación, la zona erógena. El esfuerzo es la cantidad de presión que ejerce, las ganas. La meta es la satisfacción, es decir, liberar esa presión. Y el objeto es aquello con lo que se satisface, que no está predeterminado y puede ser cualquiera. Para Freud sexual no es lo mismo que genital, sino toda búsqueda de placer corporal más allá de la necesidad.</w:t>
-      </w:r>
-    </w:p>
-    <w:p>
-      <w:pPr>
-        <w:spacing w:after="160" w:line="360"/>
-        <w:jc w:val="both"/>
-      </w:pPr>
-      <w:r>
-        <w:rPr>
-          <w:b/>
-          <w:bCs/>
-        </w:rPr>
-        <w:t xml:space="preserve">La sexualidad infantil. </w:t>
-      </w:r>
-      <w:r>
-        <w:t xml:space="preserve">Por eso Freud empieza a estudiar la sexualidad infantil y distingue varias fases en las que el niño va encontrando placer. En la fase oral (de 0 a 1 año) el placer está en la boca: chupar, incorporar. En la fase anal (de 2 a 3 años) está en retener o expulsar. En la fase fálica (de 3 a 5 años) el interés se centra en los genitales, y aparece el complejo de Edipo: el niño se enamora del padre del sexo opuesto y siente rivalidad hacia el del mismo sexo, y aparece la angustia de castración. En la fase de latencia (de los 6 años a la pubertad) la sexualidad se adormece. Y en la fase genital (desde la pubertad) la sexualidad se centra en los genitales y se dirige a otra persona.</w:t>
-      </w:r>
-    </w:p>
-    <w:p>
-      <w:pPr>
-        <w:spacing w:after="160" w:line="360"/>
-        <w:jc w:val="both"/>
-      </w:pPr>
-      <w:r>
-        <w:rPr>
-          <w:b/>
-          <w:bCs/>
-        </w:rPr>
-        <w:t xml:space="preserve">El problema de la transferencia. </w:t>
-      </w:r>
-      <w:r>
-        <w:t xml:space="preserve">Freud se encuentra con un problema. Si no recordamos algunos acontecimientos traumáticos, ¿por qué no nos curamos cuando alguien nos los cuenta? Porque no basta con saberlo, hay que revivirlo. En la terapia, el paciente traslada al terapeuta sus vivencias y los sentimientos que tenía hacia personas de su pasado: es la transferencia. Puede ser positiva, con confianza y afecto, o negativa, con hostilidad y deseos de venganza. Lejos de ser un obstáculo, es la oportunidad del psicoanálisis: el trauma se revive en el presente y se puede trabajar. Para eso el terapeuta tiene que mantener la neutralidad y no satisfacer las necesidades afectivas del paciente, mientras este vuelve a vivirlo todo.</w:t>
-      </w:r>
-    </w:p>
-    <w:p>
-      <w:pPr>
-        <w:spacing w:after="160" w:line="360"/>
-        <w:jc w:val="both"/>
-      </w:pPr>
-      <w:r>
-        <w:rPr>
-          <w:b/>
-          <w:bCs/>
-        </w:rPr>
-        <w:t xml:space="preserve">El problema del narcisismo. </w:t>
-      </w:r>
-      <w:r>
-        <w:t xml:space="preserve">Al principio Freud distinguía entre las pulsiones del yo, que buscan la autoconservación, y la pulsión sexual. Pero descubre que la libido no solo se dirige hacia objetos externos, sino que también puede dirigirse hacia el propio yo: es el narcisismo. El niño no abandona su narcisismo original, sino que lo proyecta hacia sus ideales. Y la conciencia moral actúa como un censor que mide la relación entre el yo y esos ideales. Aquí Freud se da cuenta de que el ser humano no siempre busca solo el placer, sino que también quiere cumplir con sus ideales.</w:t>
+        <w:t xml:space="preserve">Nuestra mente tiene esta última capa como mecanismo de defensa: los recuerdos traumáticos que serían imposibles de llevar en el consciente se llevan al inconsciente. A este mecanismo lo llama represión. Pero lo reprimido sigue activo y operante, y vuelve disfrazado en forma de síntoma. Por eso lo que tienen las personas enfermas no es un fallo nervioso, sino un mensaje cifrado de su inconsciente que quiere manifestarse. Freud distingue entre neurosis (histeria, obsesión, fobias), psicosis (paranoia, esquizofrenia) y perversiones, y se centra sobre todo en las neurosis.</w:t>
+      </w:r>
+    </w:p>
+    <w:p>
+      <w:pPr>
+        <w:spacing w:after="160" w:line="360"/>
+        <w:jc w:val="both"/>
+      </w:pPr>
+      <w:r>
+        <w:rPr>
+          <w:b/>
+          <w:bCs/>
+        </w:rPr>
+        <w:t xml:space="preserve">Los tres caminos al inconsciente. </w:t>
+      </w:r>
+      <w:r>
+        <w:t xml:space="preserve">Si lo reprimido sigue activo, ¿cómo se manifiesta en las personas sanas? ¿Por qué no es todo el mundo histérico? En Psicopatología de la vida cotidiana Freud explica que podemos acceder al inconsciente de manera indirecta de tres formas. La primera es la vía regia: los sueños. Cuando dormimos el consciente se relaja y el inconsciente se cuela; el sueño es la realización disfrazada de un deseo oculto, un compromiso entre el deseo y la censura. La segunda son los actos fallidos, como los lapsus, en los que por un despiste el inconsciente aparece en el consciente. La tercera son los chistes tendenciosos, que buscan burlar la censura para expresar los verdaderos deseos.</w:t>
+      </w:r>
+    </w:p>
+    <w:p>
+      <w:pPr>
+        <w:spacing w:after="160" w:line="360"/>
+        <w:jc w:val="both"/>
+      </w:pPr>
+      <w:r>
+        <w:rPr>
+          <w:b/>
+          <w:bCs/>
+        </w:rPr>
+        <w:t xml:space="preserve">El psicoanálisis y la transferencia. </w:t>
+      </w:r>
+      <w:r>
+        <w:t xml:space="preserve">Más importante que estas manifestaciones es saber interpretarlas, y para eso está el psicoanálisis: el paciente habla libremente (asociación libre) y el terapeuta escucha sin dar más importancia a una cosa que a otra. Pero no basta con que al paciente le cuenten su trauma para curarse: tiene que revivirlo. En la terapia el paciente traslada al terapeuta sus vivencias y sentimientos, positivos o negativos: es la transferencia. Así el trauma se revive en el presente y se puede trabajar, y el terapeuta tiene que mantener la neutralidad.</w:t>
+      </w:r>
+    </w:p>
+    <w:p>
+      <w:pPr>
+        <w:spacing w:after="160" w:line="360"/>
+        <w:jc w:val="both"/>
+      </w:pPr>
+      <w:r>
+        <w:rPr>
+          <w:b/>
+          <w:bCs/>
+        </w:rPr>
+        <w:t xml:space="preserve">Las pulsiones. </w:t>
+      </w:r>
+      <w:r>
+        <w:t xml:space="preserve">Nuestro aparato psíquico tiene que descargar su tensión y busca la satisfacción inmediata: es el principio del placer. Pero la vida nos enseña a posponer el placer y a tener en cuenta la realidad: es el principio de realidad. En la pulsión sexual Freud distingue la fuente (la zona del cuerpo), el esfuerzo (la cantidad de presión), la meta (liberar esa presión) y el objeto, que no está predeterminado y puede ser cualquiera. Para él sexual no es lo mismo que genital, sino toda búsqueda de placer corporal. Por eso estudia la sexualidad infantil y distingue cinco fases: oral (0-1 año), anal (2-3 años), fálica (3-5 años), en la que aparece el complejo de Edipo, latencia (de los 6 años a la pubertad) y genital (desde la pubertad).</w:t>
       </w:r>
     </w:p>
     <w:p>
@@ -317,7 +221,7 @@
         <w:t xml:space="preserve">Eros y Thanatos. </w:t>
       </w:r>
       <w:r>
-        <w:t xml:space="preserve">Poco a poco Freud encuentra que ciertas personas repiten sus traumas una y otra vez. Lo ve en los soldados de la I Guerra Mundial con neurosis de guerra, que revivían en sueños sus experiencias más terribles, y en el juego de un niño que tiraba un carrete y lo recuperaba, repitiendo la experiencia desagradable de que su madre se fuera. Es como si nos empeñáramos en hacernos daño. Si el aparato psíquico siempre buscara el placer, esto no tendría explicación. Por eso, en Más allá del principio del placer (1920), Freud da un giro y llega a un principio dual. Por un lado está Eros, la pulsión de vida, que reúne la pulsión de autoconservación y la pulsión sexual. Por otro lado está Thanatos, la pulsión de muerte: si la vida procede de lo inorgánico, es normal que haya un deseo de volver a ello. Thanatos hacia el exterior se manifiesta como agresividad, y hacia el interior como masoquismo y autodestrucción. Por eso tenemos esa necesidad de repetición: quitarnos el placer para luego dárnoslo.</w:t>
+        <w:t xml:space="preserve">Con el narcisismo Freud ve que la libido también se dirige hacia el propio yo y que el niño proyecta ese narcisismo en sus ideales, así que el hombre no solo busca placer, sino también cumplir con sus ideales. Después observa que ciertas personas repiten sus traumas, como los soldados con neurosis de guerra: nos empeñamos en hacernos daño. Por eso en Más allá del principio del placer (1920) llega a un principio dual. Eros es la pulsión de vida, que reúne la autoconservación y la pulsión sexual. Thanatos es la pulsión de muerte: si la vida procede de lo inorgánico, hay un deseo de volver a ello. Hacia el exterior se manifiesta como agresividad y hacia el interior como masoquismo y autodestrucción.</w:t>
       </w:r>
     </w:p>
     <w:p>
@@ -333,55 +237,23 @@
         <w:t xml:space="preserve">La segunda tópica. </w:t>
       </w:r>
       <w:r>
-        <w:t xml:space="preserve">En El yo y el ello (1923) Freud propone una segunda tópica, que no hay que relacionar con la primera. En la primera hablaba de capas de la mente según si un recuerdo era accesible o no; ahora habla de tres instancias que están en conflicto. El ello es la instancia más antigua, la región de nuestra mente donde están los impulsos. Se rige por principios irracionales, es egoísta, no atiende a la moral y no conoce el tiempo ni la lógica: solo quiere satisfacerse. El superyó es donde está interiorizada nuestra conciencia moral. A lo largo de la vida introyectamos las reglas sociales, empezando por las de nuestros padres, y nos formamos una imagen perfecta de nosotros mismos. El superyó nos controla y nos dice cómo deberíamos ser, y es un juez cruel e implacable. Por último está el yo, o ego, que es una parte del ello que se ha ido modificando por el contacto con el mundo exterior. Controla la motricidad, la percepción y las defensas, y actúa como una instancia mediadora entre el superyó y el ello, teniendo en cuenta además la realidad. El yo no se puede identificar sin más con el consciente, porque una parte de él también es inconsciente. Por eso el yo vive presionado por tres lados: lo que pide el ello, lo que exige el superyó y lo que permite la realidad.</w:t>
-      </w:r>
-    </w:p>
-    <w:p>
-      <w:pPr>
-        <w:spacing w:after="160" w:line="360"/>
-        <w:jc w:val="both"/>
-      </w:pPr>
-      <w:r>
-        <w:rPr>
-          <w:b/>
-          <w:bCs/>
-        </w:rPr>
-        <w:t xml:space="preserve">Tótem y tabú. </w:t>
-      </w:r>
-      <w:r>
-        <w:t xml:space="preserve">Freud aplica todo esto a la sociedad y a la cultura. En Tótem y tabú (1913) explica qué es un tabú: algo que tú puedes hacer pero no sabes por qué no. Para explicarlo propone un posible origen de la civilización, que él mismo llama un mito científico. Al principio había una horda gobernada por un padre despótico que acaparaba a todas las mujeres. Los hermanos se unieron, lo mataron y lo devoraron. Pero como al mismo tiempo lo odiaban y lo amaban, apareció la culpa, y de ahí surgieron dos reglas: no matar al tótem, que sustituye al padre, y la exogamia, no unirse con mujeres del propio clan. La civilización humana ha surgido de un pecado imperdonable, y esa culpa se transmite a lo largo de las generaciones hasta hoy. Por eso toda la sociedad humana es traumática y nos causa angustia y culpa. Con el tiempo el tótem se convierte en Dios.</w:t>
-      </w:r>
-    </w:p>
-    <w:p>
-      <w:pPr>
-        <w:spacing w:after="160" w:line="360"/>
-        <w:jc w:val="both"/>
-      </w:pPr>
-      <w:r>
-        <w:rPr>
-          <w:b/>
-          <w:bCs/>
-        </w:rPr>
-        <w:t xml:space="preserve">El porvenir de una ilusión. </w:t>
-      </w:r>
-      <w:r>
-        <w:t xml:space="preserve">En esta obra (1927) dice que la religión es una ilusión. El adulto, que se siente indefenso ante la naturaleza y la muerte, recrea una situación infantil y sustituye al padre por una fantasía, que es Dios. Como la realidad nos da miedo, creamos dioses, y Dios cumple el papel del superyó. Freud confía en que algún día la humanidad madure y pueda quitarse la idea de Dios.</w:t>
-      </w:r>
-    </w:p>
-    <w:p>
-      <w:pPr>
-        <w:spacing w:after="160" w:line="360"/>
-        <w:jc w:val="both"/>
-      </w:pPr>
-      <w:r>
-        <w:rPr>
-          <w:b/>
-          <w:bCs/>
-        </w:rPr>
-        <w:t xml:space="preserve">El malestar en la cultura. </w:t>
-      </w:r>
-      <w:r>
-        <w:t xml:space="preserve">En esta obra (1930) dice que el hombre es un lobo para el hombre (homo homini lupus). Las pulsiones animales, sobre todo la agresividad, no se pueden satisfacer en sociedad, así que la sociedad nos exige renunciar a ellas. El precio que pagamos es una culpa cada vez mayor: cuanto más avanzamos en la cultura, más reprimidos estamos, peor estamos y más culpables nos sentimos. La única vía es la sublimación, que consiste en transformar esas descargas en algo aceptable, como el arte, la ciencia o la cultura. Pero es solo un sustituto parcial y no todas las personas son capaces de sublimar, así que estamos condenados al malestar. Freud termina con una duda: ¿ganará Eros o ganará Thanatos?</w:t>
+        <w:t xml:space="preserve">En El yo y el ello (1923) Freud propone una segunda tópica, que no hay que relacionar con la primera: ya no habla de capas, sino de tres instancias en conflicto. El ello es la instancia más antigua, donde están los impulsos; es irracional, egoísta, no atiende a la moral y no conoce el tiempo. El superyó es donde está interiorizada nuestra conciencia moral: introyectamos las reglas sociales y nos formamos una imagen perfecta de nosotros mismos; nos dice cómo deberíamos ser y es un juez cruel e implacable. El yo es una parte del ello modificada por el mundo exterior; controla la motricidad y actúa como mediador entre el ello y el superyó, teniendo en cuenta la realidad.</w:t>
+      </w:r>
+    </w:p>
+    <w:p>
+      <w:pPr>
+        <w:spacing w:after="160" w:line="360"/>
+        <w:jc w:val="both"/>
+      </w:pPr>
+      <w:r>
+        <w:rPr>
+          <w:b/>
+          <w:bCs/>
+        </w:rPr>
+        <w:t xml:space="preserve">La cultura. </w:t>
+      </w:r>
+      <w:r>
+        <w:t xml:space="preserve">En Tótem y tabú (1913) Freud explica que un tabú es algo que puedes hacer pero no sabes por qué no, y propone un posible origen de la civilización. Un padre que gobernaba la horda acaparaba a todas las mujeres; los hermanos se unieron y lo mataron, pero como también lo amaban apareció la culpa, que se transmite a lo largo de las generaciones. Así la sociedad nace de un pecado imperdonable, y el tótem se acaba convirtiendo en Dios. En El porvenir de una ilusión (1927) dice que la religión es una ilusión: como la realidad nos da miedo, el adulto se mantiene en un papel infantil y pone a Dios en el lugar del padre y del superyó. Freud confía en que algún día podamos quitarnos la idea de Dios. Por último, en El malestar en la cultura (1930) dice que el hombre es un lobo para el hombre: la sociedad nos obliga a reprimir nuestras pulsiones, y cuanto más avanzamos en la cultura más reprimidos y más culpables nos sentimos. La única salida es la sublimación, transformar esas descargas en algo aceptable como el arte, pero no todos pueden hacerlo. Freud deja la duda: ¿ganará Eros o ganará Thanatos?</w:t>
       </w:r>
     </w:p>
     <w:p>
@@ -470,70 +342,43 @@
         <w:jc w:val="both"/>
       </w:pPr>
       <w:r>
-        <w:t xml:space="preserve">Desde mi punto de vista, la tesis de Freud de que el ser humano no es dueño de su propia mente solo puede ser verdad en parte. Es cierto que no siempre nos conocemos del todo y que hay impulsos, miedos y recuerdos que nos condicionan sin que nos demos cuenta. Freud tiene el mérito de haberlo estudiado y de ser considerado el padre de la psicología moderna. Pero de ahí no se sigue que el hombre sea solo un conjunto de pulsiones en conflicto.</w:t>
-      </w:r>
-    </w:p>
-    <w:p>
-      <w:pPr>
-        <w:spacing w:after="160" w:line="360"/>
-        <w:jc w:val="both"/>
-      </w:pPr>
-      <w:r>
-        <w:t xml:space="preserve">Para valorarlo hay que partir de lo que somos: el ser humano es un ser racional y es libre. ¿Qué significa ser racional? No es solo conocer, porque los animales también conocen. Tampoco es elaborar juicios, porque las máquinas también pueden encadenar razonamientos. Tampoco es conocer la verdad, porque nadie puede decir que la posee por completo. Una parte importante de ser racional es controlar los propios impulsos, y eso es justo lo que Freud parece haber negado.</w:t>
-      </w:r>
-    </w:p>
-    <w:p>
-      <w:pPr>
-        <w:spacing w:after="160" w:line="360"/>
-        <w:jc w:val="both"/>
-      </w:pPr>
-      <w:r>
-        <w:t xml:space="preserve">Sin embargo, que tengamos impulsos que no controlamos del todo no era ninguna novedad. Aristóteles ya decía que la razón no gobierna los impulsos como un amo a un esclavo, sino como se gobierna a personas libres, que a veces obedecen y a veces no. Además, el propio psicoanálisis busca que el paciente se dé cuenta de lo que tiene reprimido y lo entienda, es decir, confía en que la razón puede iluminar e integrar esos impulsos. Freud demuestra que la razón no lo puede todo, pero no que no pueda nada.</w:t>
-      </w:r>
-    </w:p>
-    <w:p>
-      <w:pPr>
-        <w:spacing w:after="160" w:line="360"/>
-        <w:jc w:val="both"/>
-      </w:pPr>
-      <w:r>
-        <w:t xml:space="preserve">El problema de fondo está en su manera de entender la mente. Psicología viene de psyché, que significa alma. Desde los orígenes del pensamiento se distingue entre el alma y el cuerpo. Platón los separaba en dos mundos: el alma venía del mundo de las ideas y había caído en un cuerpo material. Aristóteles, en cambio, entiende al ser vivo como un compuesto de alma y cuerpo. Y aquí está la diferencia entre los seres inertes y los seres vivos. Los inertes se caracterizan por el heteromatismo: más que moverse, son movidos; su unidad es una unidad de conjunto y no tienen interioridad. Los seres vivos se caracterizan por el automatismo: se mueven a sí mismos, su unidad es orgánica y tienen interioridad, es decir, tienen alma. Freud, que es el padre de la psico-logía, describe la mente con cargas, descargas y fuerzas en conflicto, como si el hombre fuera movido desde dentro por pulsiones que no domina. Es decir, lo describe más como un ser inerte que como un ser vivo con autonomía.</w:t>
-      </w:r>
-    </w:p>
-    <w:p>
-      <w:pPr>
-        <w:spacing w:after="160" w:line="360"/>
-        <w:jc w:val="both"/>
-      </w:pPr>
-      <w:r>
-        <w:t xml:space="preserve">Esto tiene consecuencias para la concepción del ser humano. Si aceptamos a Freud sin matices, el hombre es un animal más movido por la pulsión de placer y la de muerte; la moral es solo una represión impuesta por la sociedad; la religión es una neurosis; y la cultura es un sustituto de los instintos. La responsabilidad se diluye, porque siempre podemos echar la culpa al inconsciente. Y si lo que somos depende solo de lo que hemos vivido, se puede llegar, como John Money, a pensar que incluso el género o la sexualidad son solo el resultado de traumas.</w:t>
-      </w:r>
-    </w:p>
-    <w:p>
-      <w:pPr>
-        <w:spacing w:after="160" w:line="360"/>
-        <w:jc w:val="both"/>
-      </w:pPr>
-      <w:r>
-        <w:t xml:space="preserve">Para responder hay que volver a la pregunta por el ser. Parménides dijo que el ser es y el no ser no es, y de ahí concluyó que todo es ser, que el cambio es solo apariencia y que todo es Dios. Aristóteles corrige esto con el acto y la potencia y explica que el ser se dice de muchas maneras: el ser es, pero no todo lo que es, es lo mismo. Hay grados de ser: los seres inertes son; los seres vivos son y viven; y los seres humanos son, viven y entienden. La vida no se añade al ser, sino que es el ser de los seres vivos, y la inteligencia es el ser de los seres vivos inteligentes. Santo Tomás lo desarrolla con la doctrina de la participación: cada ente participa del ser en un grado. Por tanto, la racionalidad no es una capa fina por encima de las pulsiones, sino la manera de ser del ser humano, que también se nota en sus emociones y sus impulsos.</w:t>
-      </w:r>
-    </w:p>
-    <w:p>
-      <w:pPr>
-        <w:spacing w:after="160" w:line="360"/>
-        <w:jc w:val="both"/>
-      </w:pPr>
-      <w:r>
-        <w:t xml:space="preserve">Ser humano es todo miembro de la especie homo sapiens sapiens. Persona es un ser único e irrepetible, con dignidad. La palabra viene del teatro, donde la persona era la máscara o el personaje, y después pasó al Derecho como sujeto de derechos. Pero antiguamente no todos se consideraban personas: en Roma solo lo era el hombre libre, romano y paterfamilias, y no las mujeres, los hijos ni los esclavos. Con la reflexión sobre Jesucristo en los primeros concilios el concepto se amplía, y Santo Tomás de Aquino coge la definición de Boecio: persona es una sustancia individual de naturaleza racional.</w:t>
-      </w:r>
-    </w:p>
-    <w:p>
-      <w:pPr>
-        <w:spacing w:after="160" w:line="360"/>
-        <w:jc w:val="both"/>
-      </w:pPr>
-      <w:r>
-        <w:t xml:space="preserve">Entonces la persona va necesariamente unida al ser, y de ahí existe la dignidad humana: sin ser no existe. Es una dignidad ontológica, que no depende de que controlemos nuestros impulsos, de nuestra salud psíquica ni de nuestros traumas, sino que se tiene por el simple hecho de ser. Freud nos recuerda que somos frágiles, pero eso no cambia lo que somos: los seres humanos somos racionales y libres.</w:t>
+        <w:t xml:space="preserve">Desde mi punto de vista, la tesis de Freud de que el ser humano no es dueño de su propia mente solo es verdad en parte. Es cierto que no siempre nos conocemos del todo y que hay impulsos y recuerdos que nos condicionan sin darnos cuenta, y Freud tiene el mérito de ser el padre de la psicología moderna. Pero de ahí no se sigue que el hombre sea solo un conjunto de pulsiones.</w:t>
+      </w:r>
+    </w:p>
+    <w:p>
+      <w:pPr>
+        <w:spacing w:after="160" w:line="360"/>
+        <w:jc w:val="both"/>
+      </w:pPr>
+      <w:r>
+        <w:t xml:space="preserve">El ser humano es un ser racional. ¿Qué significa ser racional? No es solo conocer, porque los animales también conocen, ni encadenar razonamientos, porque las máquinas también pueden, ni poseer la verdad. Una parte importante es controlar los propios impulsos, y eso es lo que Freud niega. Sin embargo, el propio psicoanálisis busca que el paciente entienda lo que tiene reprimido, es decir, confía en la razón. Freud demuestra que la razón no lo puede todo, pero no que no pueda nada.</w:t>
+      </w:r>
+    </w:p>
+    <w:p>
+      <w:pPr>
+        <w:spacing w:after="160" w:line="360"/>
+        <w:jc w:val="both"/>
+      </w:pPr>
+      <w:r>
+        <w:t xml:space="preserve">Además, psicología viene de psyché, que significa alma. Los seres inertes se caracterizan por el heteromatismo: más que moverse, son movidos, y su unidad es de conjunto, sin interioridad. Los seres vivos se caracterizan por el automatismo: se mueven a sí mismos, tienen unidad orgánica e interioridad, tienen alma. Freud describe la mente como fuerzas y descargas que nos mueven, más parecida a lo inerte que a un ser vivo con autonomía. Si se acepta esto, la moral es solo represión, la religión una neurosis y la responsabilidad se diluye, porque siempre podemos echar la culpa al inconsciente.</w:t>
+      </w:r>
+    </w:p>
+    <w:p>
+      <w:pPr>
+        <w:spacing w:after="160" w:line="360"/>
+        <w:jc w:val="both"/>
+      </w:pPr>
+      <w:r>
+        <w:t xml:space="preserve">Para responder hay que volver al ser. Aristóteles, frente a Parménides, explica que el ser se dice de muchas maneras y que hay grados de ser: los inertes son, los vivos son y viven, y los humanos son, viven y entienden. La inteligencia no es una capa por encima de las pulsiones, sino el ser de los seres vivos inteligentes.</w:t>
+      </w:r>
+    </w:p>
+    <w:p>
+      <w:pPr>
+        <w:spacing w:after="160" w:line="360"/>
+        <w:jc w:val="both"/>
+      </w:pPr>
+      <w:r>
+        <w:t xml:space="preserve">Ser humano es todo miembro de la especie homo sapiens sapiens. Persona es un ser único e irrepetible, con dignidad. La palabra viene del teatro y antiguamente no todos eran personas: en Roma solo el hombre libre, romano y paterfamilias. Santo Tomás coge la definición de Boecio: persona es una sustancia individual de naturaleza racional. Por tanto la persona va unida al ser, y de ahí sale la dignidad humana. Es una dignidad ontológica, que no depende de que controlemos nuestros impulsos ni de nuestra salud psíquica, sino que se tiene por el simple hecho de ser. Los seres humanos somos racionales y libres.</w:t>
       </w:r>
     </w:p>
     <w:p>
@@ -611,7 +456,7 @@
         <w:spacing w:after="100" w:line="320"/>
       </w:pPr>
       <w:r>
-        <w:t xml:space="preserve">Histeria: síntomas sin lesión → realidad psíquica.</w:t>
+        <w:t xml:space="preserve">Histeria → 1ª tópica: consciente / preconsciente / inconsciente. Represión → mensaje cifrado. Transferencia: revivir el trauma.</w:t>
       </w:r>
     </w:p>
     <w:p>
@@ -637,19 +482,6 @@
         <w:spacing w:after="100" w:line="320"/>
       </w:pPr>
       <w:r>
-        <w:t xml:space="preserve">Neurosis, psicosis, perversiones.</w:t>
-      </w:r>
-    </w:p>
-    <w:p>
-      <w:pPr>
-        <w:pStyle w:val="ListParagraph"/>
-        <w:numPr>
-          <w:ilvl w:val="0"/>
-          <w:numId w:val="2"/>
-        </w:numPr>
-        <w:spacing w:after="100" w:line="320"/>
-      </w:pPr>
-      <w:r>
         <w:t xml:space="preserve">3 caminos: sueños (vía regia; deseo disfrazado; compromiso deseo-censura), actos fallidos, chistes tendenciosos. Psicoanálisis: asociación libre + atención flotante.</w:t>
       </w:r>
     </w:p>
@@ -689,19 +521,6 @@
         <w:spacing w:after="100" w:line="320"/>
       </w:pPr>
       <w:r>
-        <w:t xml:space="preserve">Transferencia (positiva / negativa; revivir; neutralidad). Narcisismo (ideales, conciencia moral).</w:t>
-      </w:r>
-    </w:p>
-    <w:p>
-      <w:pPr>
-        <w:pStyle w:val="ListParagraph"/>
-        <w:numPr>
-          <w:ilvl w:val="0"/>
-          <w:numId w:val="2"/>
-        </w:numPr>
-        <w:spacing w:after="100" w:line="320"/>
-      </w:pPr>
-      <w:r>
         <w:t xml:space="preserve">Repetición (neurosis de guerra, carrete) → Eros (autoconservación + sexual) / Thanatos (agresividad / masoquismo).</w:t>
       </w:r>
     </w:p>
@@ -754,7 +573,7 @@
         <w:spacing w:after="100" w:line="320"/>
       </w:pPr>
       <w:r>
-        <w:t xml:space="preserve">Crítica: solo verdad en parte; ¿qué es ser racional?; Aristóteles (la razón gobierna los impulsos como a personas libres); el psicoanálisis confía en la razón; psyché = alma (Platón vs Aristóteles); inerte vs vivo; consecuencias; Parménides → Aristóteles → Santo Tomás; persona (Boecio) → dignidad ontológica.</w:t>
+        <w:t xml:space="preserve">Crítica: solo verdad en parte; ¿qué es ser racional?; el psicoanálisis confía en la razón; psyché = alma; inerte vs vivo; grados de ser; persona (Boecio) → dignidad ontológica.</w:t>
       </w:r>
     </w:p>
     <w:sectPr>

</xml_diff>

<commit_message>
Freud: doctrina y comentario crítico más cohesionados y cortos; tres obras principales
Co-Authored-By: Claude Opus 5.5 <noreply@anthropic.com>
Claude-Session: https://claude.ai/code/session_01Fj7SZp3YYQfX9U1XL9NLBt
</commit_message>
<xml_diff>
--- a/formacion-general/hombre-y-mundo-moderno/apuntes-word/Freud.docx
+++ b/formacion-general/hombre-y-mundo-moderno/apuntes-word/Freud.docx
@@ -64,7 +64,7 @@
         <w:jc w:val="both"/>
       </w:pPr>
       <w:r>
-        <w:t xml:space="preserve">Sus obras principales son Estudios sobre la histeria (1895), La interpretación de los sueños (1900), Psicopatología de la vida cotidiana (1901), Tres ensayos de teoría sexual (1905), Tótem y tabú (1913), Lo inconsciente (1915), Una dificultad del psicoanálisis (1917), Más allá del principio del placer (1920), El yo y el ello (1923), El porvenir de una ilusión (1927) y El malestar en la cultura (1930).</w:t>
+        <w:t xml:space="preserve">Sus tres obras más importantes son La interpretación de los sueños (1900), donde explica el inconsciente y los sueños como vía regia para llegar a él; El yo y el ello (1923), donde expone su segunda tópica; y El malestar en la cultura (1930), donde aplica el psicoanálisis a la sociedad y explica por qué la civilización nos hace sentir culpables.</w:t>
       </w:r>
     </w:p>
     <w:p>
@@ -134,126 +134,70 @@
         <w:jc w:val="both"/>
       </w:pPr>
       <w:r>
-        <w:rPr>
-          <w:b/>
-          <w:bCs/>
-        </w:rPr>
-        <w:t xml:space="preserve">La histeria y la primera tópica. </w:t>
-      </w:r>
-      <w:r>
-        <w:t xml:space="preserve">Freud empieza estudiando la histeria, sobre todo en mujeres: tenían síntomas físicos, como parálisis o cegueras, pero ninguna lesión orgánica. Concluye que hay una realidad psíquica que produce efectos en el cuerpo. Para explicarlo propone una primera tópica, una primera clasificación de la mente: nuestra mente no es unitaria, sino que trabaja por capas. La primera capa es el consciente, donde están los recuerdos a los que tenemos acceso directo. La segunda es el preconsciente: recuerdos que no están presentes pero que son fácilmente recuperables. La tercera es el inconsciente, una zona donde están todos los recuerdos a los que no podemos acceder, pero que producen descargas de energía que nos hacen actuar o ser como somos.</w:t>
-      </w:r>
-    </w:p>
-    <w:p>
-      <w:pPr>
-        <w:spacing w:after="160" w:line="360"/>
-        <w:jc w:val="both"/>
-      </w:pPr>
-      <w:r>
-        <w:rPr>
-          <w:b/>
-          <w:bCs/>
-        </w:rPr>
-        <w:t xml:space="preserve">La represión. </w:t>
-      </w:r>
-      <w:r>
-        <w:t xml:space="preserve">Nuestra mente tiene esta última capa como mecanismo de defensa: los recuerdos traumáticos que serían imposibles de llevar en el consciente se llevan al inconsciente. A este mecanismo lo llama represión. Pero lo reprimido sigue activo y operante, y vuelve disfrazado en forma de síntoma. Por eso lo que tienen las personas enfermas no es un fallo nervioso, sino un mensaje cifrado de su inconsciente que quiere manifestarse. Freud distingue entre neurosis (histeria, obsesión, fobias), psicosis (paranoia, esquizofrenia) y perversiones, y se centra sobre todo en las neurosis.</w:t>
-      </w:r>
-    </w:p>
-    <w:p>
-      <w:pPr>
-        <w:spacing w:after="160" w:line="360"/>
-        <w:jc w:val="both"/>
-      </w:pPr>
-      <w:r>
-        <w:rPr>
-          <w:b/>
-          <w:bCs/>
-        </w:rPr>
-        <w:t xml:space="preserve">Los tres caminos al inconsciente. </w:t>
-      </w:r>
-      <w:r>
-        <w:t xml:space="preserve">Si lo reprimido sigue activo, ¿cómo se manifiesta en las personas sanas? ¿Por qué no es todo el mundo histérico? En Psicopatología de la vida cotidiana Freud explica que podemos acceder al inconsciente de manera indirecta de tres formas. La primera es la vía regia: los sueños. Cuando dormimos el consciente se relaja y el inconsciente se cuela; el sueño es la realización disfrazada de un deseo oculto, un compromiso entre el deseo y la censura. La segunda son los actos fallidos, como los lapsus, en los que por un despiste el inconsciente aparece en el consciente. La tercera son los chistes tendenciosos, que buscan burlar la censura para expresar los verdaderos deseos.</w:t>
-      </w:r>
-    </w:p>
-    <w:p>
-      <w:pPr>
-        <w:spacing w:after="160" w:line="360"/>
-        <w:jc w:val="both"/>
-      </w:pPr>
-      <w:r>
-        <w:rPr>
-          <w:b/>
-          <w:bCs/>
-        </w:rPr>
-        <w:t xml:space="preserve">El psicoanálisis y la transferencia. </w:t>
-      </w:r>
-      <w:r>
-        <w:t xml:space="preserve">Más importante que estas manifestaciones es saber interpretarlas, y para eso está el psicoanálisis: el paciente habla libremente (asociación libre) y el terapeuta escucha sin dar más importancia a una cosa que a otra. Pero no basta con que al paciente le cuenten su trauma para curarse: tiene que revivirlo. En la terapia el paciente traslada al terapeuta sus vivencias y sentimientos, positivos o negativos: es la transferencia. Así el trauma se revive en el presente y se puede trabajar, y el terapeuta tiene que mantener la neutralidad.</w:t>
-      </w:r>
-    </w:p>
-    <w:p>
-      <w:pPr>
-        <w:spacing w:after="160" w:line="360"/>
-        <w:jc w:val="both"/>
-      </w:pPr>
-      <w:r>
-        <w:rPr>
-          <w:b/>
-          <w:bCs/>
-        </w:rPr>
-        <w:t xml:space="preserve">Las pulsiones. </w:t>
-      </w:r>
-      <w:r>
-        <w:t xml:space="preserve">Nuestro aparato psíquico tiene que descargar su tensión y busca la satisfacción inmediata: es el principio del placer. Pero la vida nos enseña a posponer el placer y a tener en cuenta la realidad: es el principio de realidad. En la pulsión sexual Freud distingue la fuente (la zona del cuerpo), el esfuerzo (la cantidad de presión), la meta (liberar esa presión) y el objeto, que no está predeterminado y puede ser cualquiera. Para él sexual no es lo mismo que genital, sino toda búsqueda de placer corporal. Por eso estudia la sexualidad infantil y distingue cinco fases: oral (0-1 año), anal (2-3 años), fálica (3-5 años), en la que aparece el complejo de Edipo, latencia (de los 6 años a la pubertad) y genital (desde la pubertad).</w:t>
-      </w:r>
-    </w:p>
-    <w:p>
-      <w:pPr>
-        <w:spacing w:after="160" w:line="360"/>
-        <w:jc w:val="both"/>
-      </w:pPr>
-      <w:r>
-        <w:rPr>
-          <w:b/>
-          <w:bCs/>
-        </w:rPr>
-        <w:t xml:space="preserve">Eros y Thanatos. </w:t>
-      </w:r>
-      <w:r>
-        <w:t xml:space="preserve">Con el narcisismo Freud ve que la libido también se dirige hacia el propio yo y que el niño proyecta ese narcisismo en sus ideales, así que el hombre no solo busca placer, sino también cumplir con sus ideales. Después observa que ciertas personas repiten sus traumas, como los soldados con neurosis de guerra: nos empeñamos en hacernos daño. Por eso en Más allá del principio del placer (1920) llega a un principio dual. Eros es la pulsión de vida, que reúne la autoconservación y la pulsión sexual. Thanatos es la pulsión de muerte: si la vida procede de lo inorgánico, hay un deseo de volver a ello. Hacia el exterior se manifiesta como agresividad y hacia el interior como masoquismo y autodestrucción.</w:t>
-      </w:r>
-    </w:p>
-    <w:p>
-      <w:pPr>
-        <w:spacing w:after="160" w:line="360"/>
-        <w:jc w:val="both"/>
-      </w:pPr>
-      <w:r>
-        <w:rPr>
-          <w:b/>
-          <w:bCs/>
-        </w:rPr>
-        <w:t xml:space="preserve">La segunda tópica. </w:t>
-      </w:r>
-      <w:r>
-        <w:t xml:space="preserve">En El yo y el ello (1923) Freud propone una segunda tópica, que no hay que relacionar con la primera: ya no habla de capas, sino de tres instancias en conflicto. El ello es la instancia más antigua, donde están los impulsos; es irracional, egoísta, no atiende a la moral y no conoce el tiempo. El superyó es donde está interiorizada nuestra conciencia moral: introyectamos las reglas sociales y nos formamos una imagen perfecta de nosotros mismos; nos dice cómo deberíamos ser y es un juez cruel e implacable. El yo es una parte del ello modificada por el mundo exterior; controla la motricidad y actúa como mediador entre el ello y el superyó, teniendo en cuenta la realidad.</w:t>
-      </w:r>
-    </w:p>
-    <w:p>
-      <w:pPr>
-        <w:spacing w:after="160" w:line="360"/>
-        <w:jc w:val="both"/>
-      </w:pPr>
-      <w:r>
-        <w:rPr>
-          <w:b/>
-          <w:bCs/>
-        </w:rPr>
-        <w:t xml:space="preserve">La cultura. </w:t>
-      </w:r>
-      <w:r>
-        <w:t xml:space="preserve">En Tótem y tabú (1913) Freud explica que un tabú es algo que puedes hacer pero no sabes por qué no, y propone un posible origen de la civilización. Un padre que gobernaba la horda acaparaba a todas las mujeres; los hermanos se unieron y lo mataron, pero como también lo amaban apareció la culpa, que se transmite a lo largo de las generaciones. Así la sociedad nace de un pecado imperdonable, y el tótem se acaba convirtiendo en Dios. En El porvenir de una ilusión (1927) dice que la religión es una ilusión: como la realidad nos da miedo, el adulto se mantiene en un papel infantil y pone a Dios en el lugar del padre y del superyó. Freud confía en que algún día podamos quitarnos la idea de Dios. Por último, en El malestar en la cultura (1930) dice que el hombre es un lobo para el hombre: la sociedad nos obliga a reprimir nuestras pulsiones, y cuanto más avanzamos en la cultura más reprimidos y más culpables nos sentimos. La única salida es la sublimación, transformar esas descargas en algo aceptable como el arte, pero no todos pueden hacerlo. Freud deja la duda: ¿ganará Eros o ganará Thanatos?</w:t>
+        <w:t xml:space="preserve">Freud parte de un problema médico: la histeria. Sus pacientes, sobre todo mujeres, tenían síntomas físicos, como parálisis o cegueras, pero ninguna lesión orgánica que los explicara. Freud concluye que hay una realidad psíquica capaz de producir efectos en el cuerpo. Para explicar dónde está esa realidad propone su primera tópica: la mente no es unitaria, sino que trabaja por capas. En el consciente están los recuerdos a los que tenemos acceso directo; en el preconsciente, los que no tenemos presentes pero podemos recuperar fácilmente; y en el inconsciente, los que no podemos recuperar, pero que siguen produciendo descargas de energía que nos hacen actuar como actuamos.</w:t>
+      </w:r>
+    </w:p>
+    <w:p>
+      <w:pPr>
+        <w:spacing w:after="160" w:line="360"/>
+        <w:jc w:val="both"/>
+      </w:pPr>
+      <w:r>
+        <w:t xml:space="preserve">Los recuerdos llegan al inconsciente por la represión. Cuando vivimos algo traumático que no podríamos soportar, la mente se defiende y lo expulsa del consciente. Pero lo reprimido no desaparece: sigue activo y vuelve disfrazado en forma de síntoma. Así queda explicada la histeria: la enfermedad no es un fallo nervioso, sino un mensaje cifrado del inconsciente que quiere manifestarse.</w:t>
+      </w:r>
+    </w:p>
+    <w:p>
+      <w:pPr>
+        <w:spacing w:after="160" w:line="360"/>
+        <w:jc w:val="both"/>
+      </w:pPr>
+      <w:r>
+        <w:t xml:space="preserve">Esto plantea una pregunta: si todos reprimimos, ¿por qué no somos todos histéricos? Porque en las personas sanas lo reprimido también sale, pero por caminos indirectos, que Freud estudia en Psicopatología de la vida cotidiana. El primero, la vía regia, son los sueños: al dormir la censura se relaja y el deseo oculto se cumple disfrazado. Los otros dos son los actos fallidos, como los lapsus, y los chistes tendenciosos, que burlan la censura para expresar los verdaderos deseos.</w:t>
+      </w:r>
+    </w:p>
+    <w:p>
+      <w:pPr>
+        <w:spacing w:after="160" w:line="360"/>
+        <w:jc w:val="both"/>
+      </w:pPr>
+      <w:r>
+        <w:t xml:space="preserve">Si el inconsciente se manifiesta, se puede interpretar, y eso es lo que hace el psicoanálisis: el paciente habla libremente, diciendo todo lo que se le ocurra, y el terapeuta escucha para descifrar lo que hay detrás. Pero Freud descubre que no basta con que el paciente conozca su trauma para curarse: tiene que revivirlo. Y lo revive con el propio terapeuta, al que traslada los sentimientos que tenía hacia personas de su pasado. Es la transferencia, que se convierte en la oportunidad de la terapia, siempre que el terapeuta mantenga la neutralidad.</w:t>
+      </w:r>
+    </w:p>
+    <w:p>
+      <w:pPr>
+        <w:spacing w:after="160" w:line="360"/>
+        <w:jc w:val="both"/>
+      </w:pPr>
+      <w:r>
+        <w:t xml:space="preserve">Queda saber qué es esa energía que se reprime. Para Freud son las pulsiones. El aparato psíquico busca descargar la tensión y satisfacerse de inmediato, que es el principio del placer, pero la vida le enseña a esperar y a tener en cuenta la realidad, que es el principio de realidad. En la pulsión sexual distingue la fuente (la zona del cuerpo), el esfuerzo (la presión), la meta (liberarla) y el objeto (que puede ser cualquiera). Como para él sexual no es lo mismo que genital, sino toda búsqueda de placer corporal, la sexualidad empieza en la infancia y pasa por varias fases: oral, anal, fálica, latencia y genital. En la fase fálica aparece el complejo de Edipo, el origen de muchos de los conflictos que después se reprimen.</w:t>
+      </w:r>
+    </w:p>
+    <w:p>
+      <w:pPr>
+        <w:spacing w:after="160" w:line="360"/>
+        <w:jc w:val="both"/>
+      </w:pPr>
+      <w:r>
+        <w:t xml:space="preserve">Sin embargo, la experiencia le obliga a corregir esta idea. Con el narcisismo ve que el ser humano no solo busca placer, sino también estar a la altura de sus ideales. Y con los soldados de la I Guerra Mundial, que revivían una y otra vez sus traumas, ve que a veces nos empeñamos en hacernos daño. Si la mente solo buscara placer, esto no tendría sentido. Por eso, en Más allá del principio del placer (1920), distingue dos pulsiones: Eros, la pulsión de vida, y Thanatos, la pulsión de muerte, el deseo de volver a lo inorgánico, que hacia fuera es agresividad y hacia dentro autodestrucción.</w:t>
+      </w:r>
+    </w:p>
+    <w:p>
+      <w:pPr>
+        <w:spacing w:after="160" w:line="360"/>
+        <w:jc w:val="both"/>
+      </w:pPr>
+      <w:r>
+        <w:t xml:space="preserve">Con tantas fuerzas en conflicto, el modelo de las capas ya no basta, y en El yo y el ello (1923) Freud propone una segunda tópica, que no hay que relacionar con la primera. El ello es la parte más antigua, donde están las pulsiones; es irracional, egoísta y no conoce el tiempo ni la moral. El superyó es la conciencia moral: las normas sociales que hemos interiorizado y la imagen perfecta de nosotros mismos, un juez cruel e implacable. Y el yo es la parte del ello que ha cambiado al contacto con el mundo y que hace de mediador entre lo que pide el ello, lo que exige el superyó y lo que permite la realidad.</w:t>
+      </w:r>
+    </w:p>
+    <w:p>
+      <w:pPr>
+        <w:spacing w:after="160" w:line="360"/>
+        <w:jc w:val="both"/>
+      </w:pPr>
+      <w:r>
+        <w:t xml:space="preserve">Este conflicto entre pulsiones y normas Freud lo traslada a toda la sociedad. En Tótem y tabú (1913) explica que la civilización nace de un crimen: los hijos matan al padre que acaparaba a todas las mujeres, y la culpa que sienten se transmite hasta hoy; con el tiempo el tótem se convierte en Dios. En El porvenir de una ilusión (1927) dice que la religión es una ilusión: el adulto, con miedo a la realidad, pone a Dios en el lugar del padre. Y en El malestar en la cultura (1930) concluye que el hombre es un lobo para el hombre: la sociedad nos obliga a reprimir nuestras pulsiones, y cuanta más cultura, más culpa. Solo la sublimación, como el arte, ofrece una salida, pero no para todos. Freud termina con una duda: ¿ganará Eros o Thanatos?</w:t>
       </w:r>
     </w:p>
     <w:p>
@@ -342,43 +286,34 @@
         <w:jc w:val="both"/>
       </w:pPr>
       <w:r>
-        <w:t xml:space="preserve">Desde mi punto de vista, la tesis de Freud de que el ser humano no es dueño de su propia mente solo es verdad en parte. Es cierto que no siempre nos conocemos del todo y que hay impulsos y recuerdos que nos condicionan sin darnos cuenta, y Freud tiene el mérito de ser el padre de la psicología moderna. Pero de ahí no se sigue que el hombre sea solo un conjunto de pulsiones.</w:t>
-      </w:r>
-    </w:p>
-    <w:p>
-      <w:pPr>
-        <w:spacing w:after="160" w:line="360"/>
-        <w:jc w:val="both"/>
-      </w:pPr>
-      <w:r>
-        <w:t xml:space="preserve">El ser humano es un ser racional. ¿Qué significa ser racional? No es solo conocer, porque los animales también conocen, ni encadenar razonamientos, porque las máquinas también pueden, ni poseer la verdad. Una parte importante es controlar los propios impulsos, y eso es lo que Freud niega. Sin embargo, el propio psicoanálisis busca que el paciente entienda lo que tiene reprimido, es decir, confía en la razón. Freud demuestra que la razón no lo puede todo, pero no que no pueda nada.</w:t>
-      </w:r>
-    </w:p>
-    <w:p>
-      <w:pPr>
-        <w:spacing w:after="160" w:line="360"/>
-        <w:jc w:val="both"/>
-      </w:pPr>
-      <w:r>
-        <w:t xml:space="preserve">Además, psicología viene de psyché, que significa alma. Los seres inertes se caracterizan por el heteromatismo: más que moverse, son movidos, y su unidad es de conjunto, sin interioridad. Los seres vivos se caracterizan por el automatismo: se mueven a sí mismos, tienen unidad orgánica e interioridad, tienen alma. Freud describe la mente como fuerzas y descargas que nos mueven, más parecida a lo inerte que a un ser vivo con autonomía. Si se acepta esto, la moral es solo represión, la religión una neurosis y la responsabilidad se diluye, porque siempre podemos echar la culpa al inconsciente.</w:t>
-      </w:r>
-    </w:p>
-    <w:p>
-      <w:pPr>
-        <w:spacing w:after="160" w:line="360"/>
-        <w:jc w:val="both"/>
-      </w:pPr>
-      <w:r>
-        <w:t xml:space="preserve">Para responder hay que volver al ser. Aristóteles, frente a Parménides, explica que el ser se dice de muchas maneras y que hay grados de ser: los inertes son, los vivos son y viven, y los humanos son, viven y entienden. La inteligencia no es una capa por encima de las pulsiones, sino el ser de los seres vivos inteligentes.</w:t>
-      </w:r>
-    </w:p>
-    <w:p>
-      <w:pPr>
-        <w:spacing w:after="160" w:line="360"/>
-        <w:jc w:val="both"/>
-      </w:pPr>
-      <w:r>
-        <w:t xml:space="preserve">Ser humano es todo miembro de la especie homo sapiens sapiens. Persona es un ser único e irrepetible, con dignidad. La palabra viene del teatro y antiguamente no todos eran personas: en Roma solo el hombre libre, romano y paterfamilias. Santo Tomás coge la definición de Boecio: persona es una sustancia individual de naturaleza racional. Por tanto la persona va unida al ser, y de ahí sale la dignidad humana. Es una dignidad ontológica, que no depende de que controlemos nuestros impulsos ni de nuestra salud psíquica, sino que se tiene por el simple hecho de ser. Los seres humanos somos racionales y libres.</w:t>
+        <w:t xml:space="preserve">Desde mi punto de vista, la tesis de Freud de que el ser humano no es dueño de su propia mente solo es verdad en parte. Es cierto que hay impulsos y recuerdos que nos condicionan sin darnos cuenta, y Freud tiene el mérito de ser el padre de la psicología moderna. Pero de ahí no se sigue que el hombre sea solo un conjunto de pulsiones.</w:t>
+      </w:r>
+    </w:p>
+    <w:p>
+      <w:pPr>
+        <w:spacing w:after="160" w:line="360"/>
+        <w:jc w:val="both"/>
+      </w:pPr>
+      <w:r>
+        <w:t xml:space="preserve">El ser humano es un ser racional, y ser racional no es solo conocer, porque los animales también conocen, ni encadenar razonamientos, porque las máquinas también pueden: es también controlar los propios impulsos, que es lo que Freud niega. Sin embargo, el propio psicoanálisis busca que el paciente entienda lo que tiene reprimido, así que confía en la razón. Freud demuestra que la razón no lo puede todo, pero no que no pueda nada.</w:t>
+      </w:r>
+    </w:p>
+    <w:p>
+      <w:pPr>
+        <w:spacing w:after="160" w:line="360"/>
+        <w:jc w:val="both"/>
+      </w:pPr>
+      <w:r>
+        <w:t xml:space="preserve">El problema de fondo es que Freud, padre de la psico-logía, el estudio de la psyché o alma, describe la mente como fuerzas y descargas que nos mueven. Eso es lo propio de los seres inertes, que más que moverse son movidos y no tienen interioridad. Los seres vivos, en cambio, se mueven a sí mismos y tienen alma. Como explica Aristóteles, los inertes son, los vivos son y viven, y los humanos son, viven y entienden: la inteligencia no es una capa fina sobre las pulsiones, sino el ser del hombre.</w:t>
+      </w:r>
+    </w:p>
+    <w:p>
+      <w:pPr>
+        <w:spacing w:after="160" w:line="360"/>
+        <w:jc w:val="both"/>
+      </w:pPr>
+      <w:r>
+        <w:t xml:space="preserve">Ser humano es todo miembro de la especie homo sapiens sapiens; persona es un ser único e irrepetible, con dignidad. La palabra viene del teatro, y en Roma no todos eran personas, solo el hombre libre, romano y paterfamilias. Santo Tomás coge la definición de Boecio: persona es una sustancia individual de naturaleza racional. La persona va unida al ser, y de ahí sale su dignidad ontológica, que no depende de que controlemos nuestros impulsos ni de nuestra salud psíquica, sino que se tiene por el simple hecho de ser. Los seres humanos somos racionales y libres.</w:t>
       </w:r>
     </w:p>
     <w:p>
@@ -430,7 +365,7 @@
         <w:spacing w:after="100" w:line="320"/>
       </w:pPr>
       <w:r>
-        <w:t xml:space="preserve">Obras: Estudios sobre la histeria (1895), La interpretación de los sueños (1900), Psicopatología de la vida cotidiana (1901), Tres ensayos (1905), Tótem y tabú (1913), Una dificultad del psicoanálisis (1917), Más allá del principio del placer (1920), El yo y el ello (1923), El porvenir de una ilusión (1927), El malestar en la cultura (1930).</w:t>
+        <w:t xml:space="preserve">Obras: La interpretación de los sueños (1900), El yo y el ello (1923), El malestar en la cultura (1930).</w:t>
       </w:r>
     </w:p>
     <w:p>

</xml_diff>